<commit_message>
Finalize computadores TFG delivery
</commit_message>
<xml_diff>
--- a/tfg_computadores_phishing/docs/MEMORIA_TFG_ETSII_APA7.docx
+++ b/tfg_computadores_phishing/docs/MEMORIA_TFG_ETSII_APA7.docx
@@ -4,104 +4,391 @@
   <w:body>
     <w:p>
       <w:pPr>
+        <w:spacing w:after="200"/>
         <w:jc w:val="center"/>
       </w:pPr>
+      <w:r>
+        <w:drawing>
+          <wp:inline xmlns:a="http://schemas.openxmlformats.org/drawingml/2006/main" xmlns:pic="http://schemas.openxmlformats.org/drawingml/2006/picture">
+            <wp:extent cx="1440000" cy="608188"/>
+            <wp:docPr id="11" name="Picture 11"/>
+            <wp:cNvGraphicFramePr>
+              <a:graphicFrameLocks noChangeAspect="1"/>
+            </wp:cNvGraphicFramePr>
+            <a:graphic>
+              <a:graphicData uri="http://schemas.openxmlformats.org/drawingml/2006/picture">
+                <pic:pic>
+                  <pic:nvPicPr>
+                    <pic:cNvPr id="0" name="image.png"/>
+                    <pic:cNvPicPr/>
+                  </pic:nvPicPr>
+                  <pic:blipFill>
+                    <a:blip r:embed="rId23"/>
+                    <a:stretch>
+                      <a:fillRect/>
+                    </a:stretch>
+                  </pic:blipFill>
+                  <pic:spPr>
+                    <a:xfrm>
+                      <a:off x="0" y="0"/>
+                      <a:ext cx="1440000" cy="608188"/>
+                    </a:xfrm>
+                    <a:prstGeom prst="rect"/>
+                  </pic:spPr>
+                </pic:pic>
+              </a:graphicData>
+            </a:graphic>
+          </wp:inline>
+        </w:drawing>
+      </w:r>
+    </w:p>
+    <w:p>
+      <w:pPr>
+        <w:spacing w:before="0" w:after="80"/>
+        <w:jc w:val="center"/>
+      </w:pPr>
+      <w:r>
+        <w:rPr>
+          <w:rFonts w:ascii="Times New Roman" w:hAnsi="Times New Roman"/>
+          <w:b/>
+          <w:sz w:val="24"/>
+        </w:rPr>
+        <w:t>ESCUELA TECNICA SUPERIOR DE INGENIERIA INFORMATICA</w:t>
+      </w:r>
+    </w:p>
+    <w:p>
+      <w:pPr>
+        <w:spacing w:before="0" w:after="80"/>
+        <w:jc w:val="center"/>
+      </w:pPr>
+      <w:r>
+        <w:rPr>
+          <w:rFonts w:ascii="Times New Roman" w:hAnsi="Times New Roman"/>
+          <w:b/>
+          <w:sz w:val="22"/>
+        </w:rPr>
+        <w:t>DOBLE GRADO EN INGENIERIA INFORMATICA E INGENIERIA DE COMPUTADORES</w:t>
+      </w:r>
+    </w:p>
+    <w:p>
+      <w:pPr>
+        <w:spacing w:before="0" w:after="160"/>
+        <w:jc w:val="center"/>
+      </w:pPr>
+      <w:r>
+        <w:rPr>
+          <w:rFonts w:ascii="Times New Roman" w:hAnsi="Times New Roman"/>
+          <w:b w:val="0"/>
+          <w:sz w:val="22"/>
+        </w:rPr>
+        <w:t>CURSO ACADEMICO 2025-2026</w:t>
+      </w:r>
+    </w:p>
+    <w:p>
+      <w:pPr>
+        <w:spacing w:before="0" w:after="240"/>
+        <w:jc w:val="center"/>
+      </w:pPr>
+      <w:r>
+        <w:rPr>
+          <w:rFonts w:ascii="Times New Roman" w:hAnsi="Times New Roman"/>
+          <w:b/>
+          <w:sz w:val="24"/>
+        </w:rPr>
+        <w:t>TRABAJO FIN DE GRADO</w:t>
+      </w:r>
+    </w:p>
+    <w:p>
+      <w:pPr>
+        <w:pStyle w:val="Title"/>
+        <w:spacing w:before="0" w:after="480"/>
+        <w:jc w:val="center"/>
+      </w:pPr>
+      <w:r>
+        <w:rPr>
+          <w:rFonts w:ascii="Times New Roman" w:hAnsi="Times New Roman"/>
+          <w:b/>
+          <w:sz w:val="32"/>
+        </w:rPr>
+        <w:t>TELEGRAM COMO FUENTE DE INTELIGENCIA EN CIBERSEGURIDAD: PIPELINE DE DETECCION DE PHISHING Y MENSAJES SOSPECHOSOS PARA ENTORNOS EMPRESARIALES</w:t>
+      </w:r>
+    </w:p>
+    <w:p>
+      <w:pPr>
+        <w:spacing w:before="0" w:after="40"/>
+        <w:jc w:val="center"/>
+      </w:pPr>
+      <w:r>
+        <w:rPr>
+          <w:rFonts w:ascii="Times New Roman" w:hAnsi="Times New Roman"/>
+          <w:b w:val="0"/>
+          <w:sz w:val="24"/>
+        </w:rPr>
+        <w:t>Autor: Alvaro Osuna Flores</w:t>
+      </w:r>
+    </w:p>
+    <w:p>
+      <w:pPr>
+        <w:spacing w:before="0" w:after="360"/>
+        <w:jc w:val="center"/>
+      </w:pPr>
+      <w:r>
+        <w:rPr>
+          <w:rFonts w:ascii="Times New Roman" w:hAnsi="Times New Roman"/>
+          <w:b w:val="0"/>
+          <w:sz w:val="24"/>
+        </w:rPr>
+        <w:t>Tutora: Liliana Patricia Santacruz Valencia</w:t>
+      </w:r>
+      <w:r>
+        <w:rPr>
+          <w:rFonts w:ascii="Times New Roman" w:hAnsi="Times New Roman"/>
+          <w:b w:val="0"/>
+          <w:sz w:val="24"/>
+        </w:rPr>
+        <w:br w:type="page"/>
+      </w:r>
+    </w:p>
+    <w:p>
+      <w:pPr>
+        <w:pStyle w:val="Heading1"/>
+      </w:pPr>
+      <w:r>
+        <w:rPr>
+          <w:rFonts w:ascii="Times New Roman" w:hAnsi="Times New Roman"/>
+        </w:rPr>
+        <w:t>Resumen</w:t>
+      </w:r>
+    </w:p>
+    <w:p>
       <w:r>
         <w:rPr>
           <w:rFonts w:ascii="Times New Roman" w:hAnsi="Times New Roman"/>
           <w:sz w:val="24"/>
         </w:rPr>
-        <w:t>ESCUELA TECNICA SUPERIOR DE INGENIERIA INFORMATICA</w:t>
+        <w:t>Este Trabajo Fin de Grado presenta el diseno e integracion de un sistema para detectar mensajes de phishing y comunicaciones sospechosas procedentes de Telegram. El proyecto se ha planteado desde una perspectiva propia de Ingenieria de Computadores: no se limita a una tarea de clasificacion aislada, sino que organiza un pipeline operativo que cubre ingesta, preprocesado, inferencia, persistencia, exposicion de resultados, monitorizacion y validacion integrada.</w:t>
       </w:r>
     </w:p>
     <w:p>
-      <w:pPr>
-        <w:jc w:val="center"/>
-      </w:pPr>
       <w:r>
         <w:rPr>
           <w:rFonts w:ascii="Times New Roman" w:hAnsi="Times New Roman"/>
           <w:sz w:val="24"/>
         </w:rPr>
-        <w:t>DOBLE GRADO EN INGENIERIA INFORMATICA E INGENIERIA DE COMPUTADORES</w:t>
+        <w:t xml:space="preserve">La solucion combina Telethon para la escucha de mensajes, un modelo de lenguaje basado en DistilBERT para la inferencia binaria, MongoDB para la persistencia trazable, FastAPI para la publicacion de resultados y paneles React y Grafana para la explotacion operativa. Sobre esa base, se incorporan medidas de seguridad minima para evitar exposiciones innecesarias: API protegida con </w:t>
+      </w:r>
+      <w:r>
+        <w:rPr>
+          <w:rFonts w:ascii="Consolas" w:hAnsi="Consolas"/>
+          <w:sz w:val="20"/>
+        </w:rPr>
+        <w:t>X-API-Key</w:t>
+      </w:r>
+      <w:r>
+        <w:rPr>
+          <w:rFonts w:ascii="Times New Roman" w:hAnsi="Times New Roman"/>
+          <w:sz w:val="24"/>
+        </w:rPr>
+        <w:t>, CORS restringido, Grafana sin acceso anonimo y minimizacion de datos almacenados por defecto.</w:t>
       </w:r>
     </w:p>
     <w:p>
-      <w:pPr>
-        <w:jc w:val="center"/>
-      </w:pPr>
       <w:r>
         <w:rPr>
           <w:rFonts w:ascii="Times New Roman" w:hAnsi="Times New Roman"/>
           <w:sz w:val="24"/>
         </w:rPr>
-        <w:t>CURSO ACADEMICO 2024-2025</w:t>
+        <w:t xml:space="preserve">Los artefactos de evaluacion se versionan por </w:t>
+      </w:r>
+      <w:r>
+        <w:rPr>
+          <w:rFonts w:ascii="Consolas" w:hAnsi="Consolas"/>
+          <w:sz w:val="20"/>
+        </w:rPr>
+        <w:t>run_id</w:t>
+      </w:r>
+      <w:r>
+        <w:rPr>
+          <w:rFonts w:ascii="Times New Roman" w:hAnsi="Times New Roman"/>
+          <w:sz w:val="24"/>
+        </w:rPr>
+        <w:t xml:space="preserve">, lo que permite relacionar de forma coherente metricas, predicciones, matriz de confusion y evidencias de validacion con una ejecucion concreta. En la evaluacion offline del sistema, realizada sobre 100 muestras balanceadas, se obtuvo </w:t>
+      </w:r>
+      <w:r>
+        <w:rPr>
+          <w:rFonts w:ascii="Consolas" w:hAnsi="Consolas"/>
+          <w:sz w:val="20"/>
+        </w:rPr>
+        <w:t>accuracy=0.63</w:t>
+      </w:r>
+      <w:r>
+        <w:rPr>
+          <w:rFonts w:ascii="Times New Roman" w:hAnsi="Times New Roman"/>
+          <w:sz w:val="24"/>
+        </w:rPr>
+        <w:t xml:space="preserve">, </w:t>
+      </w:r>
+      <w:r>
+        <w:rPr>
+          <w:rFonts w:ascii="Consolas" w:hAnsi="Consolas"/>
+          <w:sz w:val="20"/>
+        </w:rPr>
+        <w:t>precision_pos=0.5823</w:t>
+      </w:r>
+      <w:r>
+        <w:rPr>
+          <w:rFonts w:ascii="Times New Roman" w:hAnsi="Times New Roman"/>
+          <w:sz w:val="24"/>
+        </w:rPr>
+        <w:t xml:space="preserve">, </w:t>
+      </w:r>
+      <w:r>
+        <w:rPr>
+          <w:rFonts w:ascii="Consolas" w:hAnsi="Consolas"/>
+          <w:sz w:val="20"/>
+        </w:rPr>
+        <w:t>recall_pos=0.92</w:t>
+      </w:r>
+      <w:r>
+        <w:rPr>
+          <w:rFonts w:ascii="Times New Roman" w:hAnsi="Times New Roman"/>
+          <w:sz w:val="24"/>
+        </w:rPr>
+        <w:t xml:space="preserve">, </w:t>
+      </w:r>
+      <w:r>
+        <w:rPr>
+          <w:rFonts w:ascii="Consolas" w:hAnsi="Consolas"/>
+          <w:sz w:val="20"/>
+        </w:rPr>
+        <w:t>f1_pos=0.7132</w:t>
+      </w:r>
+      <w:r>
+        <w:rPr>
+          <w:rFonts w:ascii="Times New Roman" w:hAnsi="Times New Roman"/>
+          <w:sz w:val="24"/>
+        </w:rPr>
+        <w:t xml:space="preserve">, </w:t>
+      </w:r>
+      <w:r>
+        <w:rPr>
+          <w:rFonts w:ascii="Consolas" w:hAnsi="Consolas"/>
+          <w:sz w:val="20"/>
+        </w:rPr>
+        <w:t>roc_auc=0.8684</w:t>
+      </w:r>
+      <w:r>
+        <w:rPr>
+          <w:rFonts w:ascii="Times New Roman" w:hAnsi="Times New Roman"/>
+          <w:sz w:val="24"/>
+        </w:rPr>
+        <w:t xml:space="preserve"> y </w:t>
+      </w:r>
+      <w:r>
+        <w:rPr>
+          <w:rFonts w:ascii="Consolas" w:hAnsi="Consolas"/>
+          <w:sz w:val="20"/>
+        </w:rPr>
+        <w:t>average_precision=0.8951</w:t>
+      </w:r>
+      <w:r>
+        <w:rPr>
+          <w:rFonts w:ascii="Times New Roman" w:hAnsi="Times New Roman"/>
+          <w:sz w:val="24"/>
+        </w:rPr>
+        <w:t xml:space="preserve">, manteniendo </w:t>
+      </w:r>
+      <w:r>
+        <w:rPr>
+          <w:rFonts w:ascii="Consolas" w:hAnsi="Consolas"/>
+          <w:sz w:val="20"/>
+        </w:rPr>
+        <w:t>THRESHOLD=0.05</w:t>
+      </w:r>
+      <w:r>
+        <w:rPr>
+          <w:rFonts w:ascii="Times New Roman" w:hAnsi="Times New Roman"/>
+          <w:sz w:val="24"/>
+        </w:rPr>
+        <w:t xml:space="preserve"> para priorizar deteccion temprana.</w:t>
       </w:r>
     </w:p>
     <w:p>
-      <w:pPr>
-        <w:jc w:val="center"/>
-      </w:pPr>
       <w:r>
         <w:rPr>
           <w:rFonts w:ascii="Times New Roman" w:hAnsi="Times New Roman"/>
           <w:sz w:val="24"/>
         </w:rPr>
-        <w:t>TRABAJO FIN DE GRADO</w:t>
+        <w:t>La principal aportacion del trabajo no es solo el modelo, sino la integracion de componentes en un flujo trazable y defendible, orientado a un escenario realista de operacion y pensado para poder desplegarse, mantenerse y auditarse como un sistema tecnico coherente.</w:t>
       </w:r>
     </w:p>
     <w:p>
-      <w:pPr>
-        <w:pStyle w:val="Title"/>
-        <w:jc w:val="center"/>
-      </w:pPr>
       <w:r>
         <w:rPr>
           <w:rFonts w:ascii="Times New Roman" w:hAnsi="Times New Roman"/>
-        </w:rPr>
-        <w:t>TELEGRAM COMO FUENTE DE INTELIGENCIA EN CIBERSEGURIDAD: PIPELINE DE DETECCION DE PHISHING Y MENSAJES SOSPECHOSOS PARA ENTORNOS EMPRESARIALES</w:t>
+          <w:sz w:val="24"/>
+        </w:rPr>
+        <w:t>Palabras clave: Telegram, phishing, ciberseguridad, pipeline, FastAPI, MongoDB, Grafana, trazabilidad, DistilBERT.</w:t>
       </w:r>
     </w:p>
     <w:p>
       <w:pPr>
-        <w:jc w:val="center"/>
-      </w:pPr>
+        <w:pStyle w:val="Heading1"/>
+      </w:pPr>
+      <w:r>
+        <w:rPr>
+          <w:rFonts w:ascii="Times New Roman" w:hAnsi="Times New Roman"/>
+        </w:rPr>
+        <w:t>1. Introduccion</w:t>
+      </w:r>
+    </w:p>
+    <w:p>
+      <w:pPr>
+        <w:pStyle w:val="Heading2"/>
+      </w:pPr>
+      <w:r>
+        <w:rPr>
+          <w:rFonts w:ascii="Times New Roman" w:hAnsi="Times New Roman"/>
+        </w:rPr>
+        <w:t>1.1 Motivacion</w:t>
+      </w:r>
+    </w:p>
+    <w:p>
       <w:r>
         <w:rPr>
           <w:rFonts w:ascii="Times New Roman" w:hAnsi="Times New Roman"/>
           <w:sz w:val="24"/>
         </w:rPr>
-        <w:t>Autor: Alvaro Osuna Flores</w:t>
+        <w:t>Telegram se ha convertido en un entorno de interes para la ciberseguridad por dos motivos complementarios. Por un lado, es una plataforma ampliamente utilizada para comunicacion legitima, coordinacion y difusion rapida de mensajes. Por otro, sus canales, grupos y dinamica de propagacion facilitan tambien la distribucion de enlaces fraudulentos, senuelos de phishing, credenciales comprometidas o conversaciones relevantes para la inteligencia de amenazas (Europol, 2022; Guo et al., 2024).</w:t>
       </w:r>
     </w:p>
     <w:p>
-      <w:pPr>
-        <w:jc w:val="center"/>
-      </w:pPr>
       <w:r>
         <w:rPr>
           <w:rFonts w:ascii="Times New Roman" w:hAnsi="Times New Roman"/>
           <w:sz w:val="24"/>
         </w:rPr>
-        <w:t>Tutora: Liliana Patricia Santacruz Valencia</w:t>
-      </w:r>
+        <w:t>Desde una perspectiva operacional, el problema no consiste solo en clasificar texto. El reto real es construir un sistema capaz de recibir mensajes en tiempo casi real, tratarlos de manera consistente, decidir con que evidencia se almacenan, exponer resultados a otros componentes y mantener observabilidad suficiente para su revision posterior. Esa naturaleza integrada hace que el proyecto encaje especialmente bien en Ingenieria de Computadores.</w:t>
+      </w:r>
+    </w:p>
+    <w:p>
       <w:r>
         <w:rPr>
           <w:rFonts w:ascii="Times New Roman" w:hAnsi="Times New Roman"/>
           <w:sz w:val="24"/>
         </w:rPr>
-        <w:br w:type="page"/>
+        <w:t>Ademas, un analisis manual continuo resulta costoso, poco escalable y propenso a errores. En consecuencia, es razonable automatizar la primera clasificacion, siempre que el sistema deje trazabilidad tecnica suficiente para justificar la salida producida y para explicar como se ha llegado a ella.</w:t>
       </w:r>
     </w:p>
     <w:p>
       <w:pPr>
-        <w:pStyle w:val="Heading1"/>
+        <w:pStyle w:val="Heading2"/>
       </w:pPr>
       <w:r>
         <w:rPr>
           <w:rFonts w:ascii="Times New Roman" w:hAnsi="Times New Roman"/>
         </w:rPr>
-        <w:t>Resumen</w:t>
+        <w:t>1.2 Objetivos</w:t>
       </w:r>
     </w:p>
     <w:p>
@@ -110,7 +397,7 @@
           <w:rFonts w:ascii="Times New Roman" w:hAnsi="Times New Roman"/>
           <w:sz w:val="24"/>
         </w:rPr>
-        <w:t>Este Trabajo Fin de Grado presenta el diseno e integracion de un sistema para detectar mensajes de phishing y comunicaciones sospechosas procedentes de Telegram. El proyecto se ha planteado desde una perspectiva propia de Ingenieria de Computadores: no se limita a una tarea de clasificacion aislada, sino que organiza un pipeline operativo que cubre ingesta, preprocesado, inferencia, persistencia, exposicion de resultados, monitorizacion y validacion integrada.</w:t>
+        <w:t>Los objetivos planteados para este trabajo son los siguientes.</w:t>
       </w:r>
     </w:p>
     <w:p>
@@ -119,649 +406,418 @@
           <w:rFonts w:ascii="Times New Roman" w:hAnsi="Times New Roman"/>
           <w:sz w:val="24"/>
         </w:rPr>
-        <w:t xml:space="preserve">La solucion combina Telethon para la escucha de mensajes, un modelo de lenguaje basado en DistilBERT para la inferencia binaria, MongoDB para la persistencia trazable, FastAPI para la publicacion de resultados y paneles React y Grafana para la explotacion operativa. Sobre esa base, se incorporan medidas de seguridad minima para evitar exposiciones innecesarias: API protegida con </w:t>
+        <w:t>Objetivo general</w:t>
+      </w:r>
+    </w:p>
+    <w:p>
+      <w:r>
+        <w:rPr>
+          <w:rFonts w:ascii="Times New Roman" w:hAnsi="Times New Roman"/>
+          <w:sz w:val="24"/>
+        </w:rPr>
+        <w:t>Desarrollar un pipeline modular para capturar, procesar y clasificar mensajes de Telegram relacionados con phishing o actividad sospechosa, integrando almacenamiento, publicacion de resultados y monitorizacion tecnica para su uso en un contexto empresarial.</w:t>
+      </w:r>
+    </w:p>
+    <w:p>
+      <w:r>
+        <w:rPr>
+          <w:rFonts w:ascii="Times New Roman" w:hAnsi="Times New Roman"/>
+          <w:sz w:val="24"/>
+        </w:rPr>
+        <w:t>Objetivos especificos</w:t>
+      </w:r>
+    </w:p>
+    <w:p>
+      <w:pPr>
+        <w:pStyle w:val="ListNumber"/>
+      </w:pPr>
+      <w:r>
+        <w:rPr>
+          <w:rFonts w:ascii="Times New Roman" w:hAnsi="Times New Roman"/>
+        </w:rPr>
+        <w:t>Implementar la ingesta automatica de mensajes desde Telegram mediante su API.</w:t>
+      </w:r>
+    </w:p>
+    <w:p>
+      <w:pPr>
+        <w:pStyle w:val="ListNumber"/>
+      </w:pPr>
+      <w:r>
+        <w:rPr>
+          <w:rFonts w:ascii="Times New Roman" w:hAnsi="Times New Roman"/>
+        </w:rPr>
+        <w:t>Integrar un flujo de preprocesado e inferencia con un modelo binario entrenado previamente.</w:t>
+      </w:r>
+    </w:p>
+    <w:p>
+      <w:pPr>
+        <w:pStyle w:val="ListNumber"/>
+      </w:pPr>
+      <w:r>
+        <w:rPr>
+          <w:rFonts w:ascii="Times New Roman" w:hAnsi="Times New Roman"/>
+        </w:rPr>
+        <w:t>Persistir evidencia tecnica suficiente en MongoDB sin almacenar por defecto mas datos sensibles de los estrictamente necesarios.</w:t>
+      </w:r>
+    </w:p>
+    <w:p>
+      <w:pPr>
+        <w:pStyle w:val="ListNumber"/>
+      </w:pPr>
+      <w:r>
+        <w:rPr>
+          <w:rFonts w:ascii="Times New Roman" w:hAnsi="Times New Roman"/>
+        </w:rPr>
+        <w:t xml:space="preserve">Versionar los artefactos de evaluacion por </w:t>
       </w:r>
       <w:r>
         <w:rPr>
           <w:rFonts w:ascii="Consolas" w:hAnsi="Consolas"/>
           <w:sz w:val="20"/>
         </w:rPr>
-        <w:t>X-API-Key</w:t>
-      </w:r>
+        <w:t>run_id</w:t>
+      </w:r>
+      <w:r>
+        <w:rPr>
+          <w:rFonts w:ascii="Times New Roman" w:hAnsi="Times New Roman"/>
+        </w:rPr>
+        <w:t xml:space="preserve"> para mantener coherencia entre ejecuciones, metricas y endpoints.</w:t>
+      </w:r>
+    </w:p>
+    <w:p>
+      <w:pPr>
+        <w:pStyle w:val="ListNumber"/>
+      </w:pPr>
+      <w:r>
+        <w:rPr>
+          <w:rFonts w:ascii="Times New Roman" w:hAnsi="Times New Roman"/>
+        </w:rPr>
+        <w:t>Exponer resultados mediante una API reutilizable y visualizarlos en un dashboard web y en Grafana.</w:t>
+      </w:r>
+    </w:p>
+    <w:p>
+      <w:pPr>
+        <w:pStyle w:val="ListNumber"/>
+      </w:pPr>
+      <w:r>
+        <w:rPr>
+          <w:rFonts w:ascii="Times New Roman" w:hAnsi="Times New Roman"/>
+        </w:rPr>
+        <w:t>Validar el sistema con pruebas de API, evaluacion offline y casos simulados de integracion.</w:t>
+      </w:r>
+    </w:p>
+    <w:p>
+      <w:pPr>
+        <w:pStyle w:val="Heading2"/>
+      </w:pPr>
+      <w:r>
+        <w:rPr>
+          <w:rFonts w:ascii="Times New Roman" w:hAnsi="Times New Roman"/>
+        </w:rPr>
+        <w:t>1.3 Estructura del documento</w:t>
+      </w:r>
+    </w:p>
+    <w:p>
       <w:r>
         <w:rPr>
           <w:rFonts w:ascii="Times New Roman" w:hAnsi="Times New Roman"/>
           <w:sz w:val="24"/>
         </w:rPr>
-        <w:t>, CORS restringido, Grafana sin acceso anonimo y minimizacion de datos almacenados por defecto.</w:t>
+        <w:t>La memoria se organiza en seis bloques. En primer lugar se presenta el contexto del problema y la justificacion tecnica del enfoque adoptado. A continuacion se describe la metodologia, la arquitectura y los requisitos. Despues se detalla el desarrollo del pipeline, la integracion entre componentes y las decisiones de almacenamiento y seguridad. Finalmente se analizan los resultados, las limitaciones detectadas y las conclusiones del trabajo.</w:t>
       </w:r>
     </w:p>
     <w:p>
+      <w:pPr>
+        <w:pStyle w:val="Heading1"/>
+      </w:pPr>
+      <w:r>
+        <w:rPr>
+          <w:rFonts w:ascii="Times New Roman" w:hAnsi="Times New Roman"/>
+        </w:rPr>
+        <w:t>2. Contexto</w:t>
+      </w:r>
+    </w:p>
+    <w:p>
+      <w:pPr>
+        <w:pStyle w:val="Heading2"/>
+      </w:pPr>
+      <w:r>
+        <w:rPr>
+          <w:rFonts w:ascii="Times New Roman" w:hAnsi="Times New Roman"/>
+        </w:rPr>
+        <w:t>2.1 Telegram como superficie de interes en ciberseguridad</w:t>
+      </w:r>
+    </w:p>
+    <w:p>
       <w:r>
         <w:rPr>
           <w:rFonts w:ascii="Times New Roman" w:hAnsi="Times New Roman"/>
           <w:sz w:val="24"/>
         </w:rPr>
-        <w:t xml:space="preserve">Los artefactos de evaluacion se versionan por </w:t>
-      </w:r>
-      <w:r>
-        <w:rPr>
-          <w:rFonts w:ascii="Consolas" w:hAnsi="Consolas"/>
-          <w:sz w:val="20"/>
-        </w:rPr>
-        <w:t>run_id</w:t>
-      </w:r>
+        <w:t>La literatura reciente y los informes del sector coinciden en que Telegram se ha consolidado como una fuente dual: sirve tanto para comunicaciones legitimas como para actividades ilicitas y de coordinacion criminal (Europol, 2022; Guo et al., 2024). Esa dualidad lo convierte en un espacio util para la inteligencia temprana en ciberseguridad.</w:t>
+      </w:r>
+    </w:p>
+    <w:p>
       <w:r>
         <w:rPr>
           <w:rFonts w:ascii="Times New Roman" w:hAnsi="Times New Roman"/>
           <w:sz w:val="24"/>
         </w:rPr>
-        <w:t xml:space="preserve">, lo que permite relacionar de forma coherente metricas, predicciones, matriz de confusion y evidencias de validacion con una ejecucion concreta. En la evaluacion offline del sistema, realizada sobre 100 muestras balanceadas, se obtuvo </w:t>
-      </w:r>
-      <w:r>
-        <w:rPr>
-          <w:rFonts w:ascii="Consolas" w:hAnsi="Consolas"/>
-          <w:sz w:val="20"/>
-        </w:rPr>
-        <w:t>accuracy=0.63</w:t>
-      </w:r>
+        <w:t>Para una empresa, esto tiene una consecuencia clara: conviene disponer de mecanismos que permitan observar, filtrar y priorizar mensajes potencialmente peligrosos sin depender exclusivamente de la revision manual. De forma particular, el phishing sigue siendo una de las amenazas mas frecuentes y mas efectivas, por lo que detectar indicadores tempranos en mensajes o enlaces compartidos puede reducir el tiempo de reaccion.</w:t>
+      </w:r>
+    </w:p>
+    <w:p>
+      <w:pPr>
+        <w:pStyle w:val="Heading2"/>
+      </w:pPr>
+      <w:r>
+        <w:rPr>
+          <w:rFonts w:ascii="Times New Roman" w:hAnsi="Times New Roman"/>
+        </w:rPr>
+        <w:t>2.2 Necesidad de un enfoque de sistemas</w:t>
+      </w:r>
+    </w:p>
+    <w:p>
       <w:r>
         <w:rPr>
           <w:rFonts w:ascii="Times New Roman" w:hAnsi="Times New Roman"/>
           <w:sz w:val="24"/>
         </w:rPr>
-        <w:t xml:space="preserve">, </w:t>
-      </w:r>
-      <w:r>
-        <w:rPr>
-          <w:rFonts w:ascii="Consolas" w:hAnsi="Consolas"/>
-          <w:sz w:val="20"/>
-        </w:rPr>
-        <w:t>precision_pos=0.5823</w:t>
-      </w:r>
+        <w:t>En este trabajo no basta con responder si un mensaje parece benigno o sospechoso. La pregunta relevante es mas amplia:</w:t>
+      </w:r>
+    </w:p>
+    <w:p>
+      <w:pPr>
+        <w:pStyle w:val="ListBullet"/>
+      </w:pPr>
+      <w:r>
+        <w:rPr>
+          <w:rFonts w:ascii="Times New Roman" w:hAnsi="Times New Roman"/>
+        </w:rPr>
+        <w:t>como llega el mensaje al sistema;</w:t>
+      </w:r>
+    </w:p>
+    <w:p>
+      <w:pPr>
+        <w:pStyle w:val="ListBullet"/>
+      </w:pPr>
+      <w:r>
+        <w:rPr>
+          <w:rFonts w:ascii="Times New Roman" w:hAnsi="Times New Roman"/>
+        </w:rPr>
+        <w:t>como se procesa y clasifica;</w:t>
+      </w:r>
+    </w:p>
+    <w:p>
+      <w:pPr>
+        <w:pStyle w:val="ListBullet"/>
+      </w:pPr>
+      <w:r>
+        <w:rPr>
+          <w:rFonts w:ascii="Times New Roman" w:hAnsi="Times New Roman"/>
+        </w:rPr>
+        <w:t>que datos se conservan;</w:t>
+      </w:r>
+    </w:p>
+    <w:p>
+      <w:pPr>
+        <w:pStyle w:val="ListBullet"/>
+      </w:pPr>
+      <w:r>
+        <w:rPr>
+          <w:rFonts w:ascii="Times New Roman" w:hAnsi="Times New Roman"/>
+        </w:rPr>
+        <w:t>como se audita la ejecucion;</w:t>
+      </w:r>
+    </w:p>
+    <w:p>
+      <w:pPr>
+        <w:pStyle w:val="ListBullet"/>
+      </w:pPr>
+      <w:r>
+        <w:rPr>
+          <w:rFonts w:ascii="Times New Roman" w:hAnsi="Times New Roman"/>
+        </w:rPr>
+        <w:t>como se consumen los resultados desde otros componentes.</w:t>
+      </w:r>
+    </w:p>
+    <w:p>
       <w:r>
         <w:rPr>
           <w:rFonts w:ascii="Times New Roman" w:hAnsi="Times New Roman"/>
           <w:sz w:val="24"/>
         </w:rPr>
-        <w:t xml:space="preserve">, </w:t>
-      </w:r>
-      <w:r>
-        <w:rPr>
-          <w:rFonts w:ascii="Consolas" w:hAnsi="Consolas"/>
-          <w:sz w:val="20"/>
-        </w:rPr>
-        <w:t>recall_pos=0.92</w:t>
-      </w:r>
+        <w:t>Estas preguntas obligan a pensar el problema como un pipeline de sistemas. Por eso, el proyecto no se ha orientado solo a la mejora de un clasificador, sino al ensamblaje de varios modulos coordinados que permitan desplegar la solucion, validarla y operarla.</w:t>
+      </w:r>
+    </w:p>
+    <w:p>
+      <w:pPr>
+        <w:pStyle w:val="Heading2"/>
+      </w:pPr>
+      <w:r>
+        <w:rPr>
+          <w:rFonts w:ascii="Times New Roman" w:hAnsi="Times New Roman"/>
+        </w:rPr>
+        <w:t>2.3 Soluciones relacionadas y hueco del proyecto</w:t>
+      </w:r>
+    </w:p>
+    <w:p>
       <w:r>
         <w:rPr>
           <w:rFonts w:ascii="Times New Roman" w:hAnsi="Times New Roman"/>
           <w:sz w:val="24"/>
         </w:rPr>
-        <w:t xml:space="preserve">, </w:t>
-      </w:r>
-      <w:r>
-        <w:rPr>
-          <w:rFonts w:ascii="Consolas" w:hAnsi="Consolas"/>
-          <w:sz w:val="20"/>
-        </w:rPr>
-        <w:t>f1_pos=0.7132</w:t>
-      </w:r>
+        <w:t>Existen soluciones comerciales y academicas para monitorizar fuentes abiertas, orquestar indicadores o aplicar modelos de lenguaje a ciberseguridad. Sin embargo, muchas de esas soluciones son generalistas, costosas o estan poco centradas en una integracion ligera y modular sobre Telegram. El hueco que cubre este TFG consiste en demostrar una arquitectura defendible, con tecnologias accesibles y con especial atencion a:</w:t>
+      </w:r>
+    </w:p>
+    <w:p>
+      <w:pPr>
+        <w:pStyle w:val="ListBullet"/>
+      </w:pPr>
+      <w:r>
+        <w:rPr>
+          <w:rFonts w:ascii="Times New Roman" w:hAnsi="Times New Roman"/>
+        </w:rPr>
+        <w:t>portabilidad mediante Docker;</w:t>
+      </w:r>
+    </w:p>
+    <w:p>
+      <w:pPr>
+        <w:pStyle w:val="ListBullet"/>
+      </w:pPr>
+      <w:r>
+        <w:rPr>
+          <w:rFonts w:ascii="Times New Roman" w:hAnsi="Times New Roman"/>
+        </w:rPr>
+        <w:t>almacenamiento flexible en MongoDB;</w:t>
+      </w:r>
+    </w:p>
+    <w:p>
+      <w:pPr>
+        <w:pStyle w:val="ListBullet"/>
+      </w:pPr>
+      <w:r>
+        <w:rPr>
+          <w:rFonts w:ascii="Times New Roman" w:hAnsi="Times New Roman"/>
+        </w:rPr>
+        <w:t>interfaz de consulta basada en API;</w:t>
+      </w:r>
+    </w:p>
+    <w:p>
+      <w:pPr>
+        <w:pStyle w:val="ListBullet"/>
+      </w:pPr>
+      <w:r>
+        <w:rPr>
+          <w:rFonts w:ascii="Times New Roman" w:hAnsi="Times New Roman"/>
+        </w:rPr>
+        <w:t>capa ligera de visualizacion;</w:t>
+      </w:r>
+    </w:p>
+    <w:p>
+      <w:pPr>
+        <w:pStyle w:val="ListBullet"/>
+      </w:pPr>
+      <w:r>
+        <w:rPr>
+          <w:rFonts w:ascii="Times New Roman" w:hAnsi="Times New Roman"/>
+        </w:rPr>
+        <w:t>trazabilidad por ejecucion.</w:t>
+      </w:r>
+    </w:p>
+    <w:p>
+      <w:pPr>
+        <w:pStyle w:val="Heading2"/>
+      </w:pPr>
+      <w:r>
+        <w:rPr>
+          <w:rFonts w:ascii="Times New Roman" w:hAnsi="Times New Roman"/>
+        </w:rPr>
+        <w:t>2.4 Criterio de seguridad minima</w:t>
+      </w:r>
+    </w:p>
+    <w:p>
       <w:r>
         <w:rPr>
           <w:rFonts w:ascii="Times New Roman" w:hAnsi="Times New Roman"/>
           <w:sz w:val="24"/>
         </w:rPr>
-        <w:t xml:space="preserve">, </w:t>
-      </w:r>
-      <w:r>
-        <w:rPr>
-          <w:rFonts w:ascii="Consolas" w:hAnsi="Consolas"/>
-          <w:sz w:val="20"/>
-        </w:rPr>
-        <w:t>roc_auc=0.8684</w:t>
-      </w:r>
+        <w:t>La revision de tutoria obligo a reforzar el sistema en un aspecto importante: la explotacion minima segura. A partir de esa revision se fijaron cinco criterios:</w:t>
+      </w:r>
+    </w:p>
+    <w:p>
+      <w:pPr>
+        <w:pStyle w:val="ListNumber"/>
+      </w:pPr>
+      <w:r>
+        <w:rPr>
+          <w:rFonts w:ascii="Times New Roman" w:hAnsi="Times New Roman"/>
+        </w:rPr>
+        <w:t>no publicar MongoDB al exterior por defecto;</w:t>
+      </w:r>
+    </w:p>
+    <w:p>
+      <w:pPr>
+        <w:pStyle w:val="ListNumber"/>
+      </w:pPr>
+      <w:r>
+        <w:rPr>
+          <w:rFonts w:ascii="Times New Roman" w:hAnsi="Times New Roman"/>
+        </w:rPr>
+        <w:t>exigir autenticacion simple en la API;</w:t>
+      </w:r>
+    </w:p>
+    <w:p>
+      <w:pPr>
+        <w:pStyle w:val="ListNumber"/>
+      </w:pPr>
+      <w:r>
+        <w:rPr>
+          <w:rFonts w:ascii="Times New Roman" w:hAnsi="Times New Roman"/>
+        </w:rPr>
+        <w:t>desactivar acceso anonimo en Grafana;</w:t>
+      </w:r>
+    </w:p>
+    <w:p>
+      <w:pPr>
+        <w:pStyle w:val="ListNumber"/>
+      </w:pPr>
+      <w:r>
+        <w:rPr>
+          <w:rFonts w:ascii="Times New Roman" w:hAnsi="Times New Roman"/>
+        </w:rPr>
+        <w:t>restringir CORS a origenes concretos;</w:t>
+      </w:r>
+    </w:p>
+    <w:p>
+      <w:pPr>
+        <w:pStyle w:val="ListNumber"/>
+      </w:pPr>
+      <w:r>
+        <w:rPr>
+          <w:rFonts w:ascii="Times New Roman" w:hAnsi="Times New Roman"/>
+        </w:rPr>
+        <w:t>minimizar los datos personales o textuales persistidos en MongoDB.</w:t>
+      </w:r>
+    </w:p>
+    <w:p>
       <w:r>
         <w:rPr>
           <w:rFonts w:ascii="Times New Roman" w:hAnsi="Times New Roman"/>
           <w:sz w:val="24"/>
         </w:rPr>
-        <w:t xml:space="preserve"> y </w:t>
-      </w:r>
-      <w:r>
-        <w:rPr>
-          <w:rFonts w:ascii="Consolas" w:hAnsi="Consolas"/>
-          <w:sz w:val="20"/>
-        </w:rPr>
-        <w:t>average_precision=0.8951</w:t>
-      </w:r>
-      <w:r>
-        <w:rPr>
-          <w:rFonts w:ascii="Times New Roman" w:hAnsi="Times New Roman"/>
-          <w:sz w:val="24"/>
-        </w:rPr>
-        <w:t xml:space="preserve">, manteniendo </w:t>
-      </w:r>
-      <w:r>
-        <w:rPr>
-          <w:rFonts w:ascii="Consolas" w:hAnsi="Consolas"/>
-          <w:sz w:val="20"/>
-        </w:rPr>
-        <w:t>THRESHOLD=0.05</w:t>
-      </w:r>
-      <w:r>
-        <w:rPr>
-          <w:rFonts w:ascii="Times New Roman" w:hAnsi="Times New Roman"/>
-          <w:sz w:val="24"/>
-        </w:rPr>
-        <w:t xml:space="preserve"> para priorizar deteccion temprana.</w:t>
+        <w:t>Este conjunto de decisiones no convierte el sistema en una plataforma final de produccion, pero si lo hace mas coherente y defendible desde el punto de vista tecnico.</w:t>
       </w:r>
     </w:p>
     <w:p>
+      <w:pPr>
+        <w:pStyle w:val="Heading1"/>
+      </w:pPr>
       <w:r>
         <w:rPr>
           <w:rFonts w:ascii="Times New Roman" w:hAnsi="Times New Roman"/>
-          <w:sz w:val="24"/>
-        </w:rPr>
-        <w:t>La principal aportacion del trabajo no es solo el modelo, sino la integracion de componentes en un flujo trazable y defendible, orientado a un escenario realista de operacion y pensado para poder desplegarse, mantenerse y auditarse como un sistema tecnico coherente.</w:t>
-      </w:r>
-    </w:p>
-    <w:p>
-      <w:r>
-        <w:rPr>
-          <w:rFonts w:ascii="Times New Roman" w:hAnsi="Times New Roman"/>
-          <w:sz w:val="24"/>
-        </w:rPr>
-        <w:t>Palabras clave: Telegram, phishing, ciberseguridad, pipeline, FastAPI, MongoDB, Grafana, trazabilidad, DistilBERT.</w:t>
-      </w:r>
-    </w:p>
-    <w:p>
-      <w:pPr>
-        <w:pStyle w:val="Heading1"/>
-      </w:pPr>
-      <w:r>
-        <w:rPr>
-          <w:rFonts w:ascii="Times New Roman" w:hAnsi="Times New Roman"/>
-        </w:rPr>
-        <w:t>1. Introduccion</w:t>
-      </w:r>
-    </w:p>
-    <w:p>
-      <w:pPr>
-        <w:pStyle w:val="Heading2"/>
-      </w:pPr>
-      <w:r>
-        <w:rPr>
-          <w:rFonts w:ascii="Times New Roman" w:hAnsi="Times New Roman"/>
-        </w:rPr>
-        <w:t>1.1 Motivacion</w:t>
-      </w:r>
-    </w:p>
-    <w:p>
-      <w:r>
-        <w:rPr>
-          <w:rFonts w:ascii="Times New Roman" w:hAnsi="Times New Roman"/>
-          <w:sz w:val="24"/>
-        </w:rPr>
-        <w:t>Telegram se ha convertido en un entorno de interes para la ciberseguridad por dos motivos complementarios. Por un lado, es una plataforma ampliamente utilizada para comunicacion legitima, coordinacion y difusion rapida de mensajes. Por otro, sus canales, grupos y dinamica de propagacion facilitan tambien la distribucion de enlaces fraudulentos, senuelos de phishing, credenciales comprometidas o conversaciones relevantes para la inteligencia de amenazas (Europol, 2022; Guo et al., 2024).</w:t>
-      </w:r>
-    </w:p>
-    <w:p>
-      <w:r>
-        <w:rPr>
-          <w:rFonts w:ascii="Times New Roman" w:hAnsi="Times New Roman"/>
-          <w:sz w:val="24"/>
-        </w:rPr>
-        <w:t>Desde una perspectiva operacional, el problema no consiste solo en clasificar texto. El reto real es construir un sistema capaz de recibir mensajes en tiempo casi real, tratarlos de manera consistente, decidir con que evidencia se almacenan, exponer resultados a otros componentes y mantener observabilidad suficiente para su revision posterior. Esa naturaleza integrada hace que el proyecto encaje especialmente bien en Ingenieria de Computadores.</w:t>
-      </w:r>
-    </w:p>
-    <w:p>
-      <w:r>
-        <w:rPr>
-          <w:rFonts w:ascii="Times New Roman" w:hAnsi="Times New Roman"/>
-          <w:sz w:val="24"/>
-        </w:rPr>
-        <w:t>Ademas, un analisis manual continuo resulta costoso, poco escalable y propenso a errores. En consecuencia, es razonable automatizar la primera clasificacion, siempre que el sistema deje trazabilidad tecnica suficiente para justificar la salida producida y para explicar como se ha llegado a ella.</w:t>
-      </w:r>
-    </w:p>
-    <w:p>
-      <w:pPr>
-        <w:pStyle w:val="Heading2"/>
-      </w:pPr>
-      <w:r>
-        <w:rPr>
-          <w:rFonts w:ascii="Times New Roman" w:hAnsi="Times New Roman"/>
-        </w:rPr>
-        <w:t>1.2 Objetivos</w:t>
-      </w:r>
-    </w:p>
-    <w:p>
-      <w:r>
-        <w:rPr>
-          <w:rFonts w:ascii="Times New Roman" w:hAnsi="Times New Roman"/>
-          <w:sz w:val="24"/>
-        </w:rPr>
-        <w:t>Los objetivos planteados para este trabajo son los siguientes.</w:t>
-      </w:r>
-    </w:p>
-    <w:p>
-      <w:r>
-        <w:rPr>
-          <w:rFonts w:ascii="Times New Roman" w:hAnsi="Times New Roman"/>
-          <w:sz w:val="24"/>
-        </w:rPr>
-        <w:t>Objetivo general</w:t>
-      </w:r>
-    </w:p>
-    <w:p>
-      <w:r>
-        <w:rPr>
-          <w:rFonts w:ascii="Times New Roman" w:hAnsi="Times New Roman"/>
-          <w:sz w:val="24"/>
-        </w:rPr>
-        <w:t>Desarrollar un pipeline modular para capturar, procesar y clasificar mensajes de Telegram relacionados con phishing o actividad sospechosa, integrando almacenamiento, publicacion de resultados y monitorizacion tecnica para su uso en un contexto empresarial.</w:t>
-      </w:r>
-    </w:p>
-    <w:p>
-      <w:r>
-        <w:rPr>
-          <w:rFonts w:ascii="Times New Roman" w:hAnsi="Times New Roman"/>
-          <w:sz w:val="24"/>
-        </w:rPr>
-        <w:t>Objetivos especificos</w:t>
-      </w:r>
-    </w:p>
-    <w:p>
-      <w:pPr>
-        <w:pStyle w:val="ListNumber"/>
-      </w:pPr>
-      <w:r>
-        <w:rPr>
-          <w:rFonts w:ascii="Times New Roman" w:hAnsi="Times New Roman"/>
-        </w:rPr>
-        <w:t>Implementar la ingesta automatica de mensajes desde Telegram mediante su API.</w:t>
-      </w:r>
-    </w:p>
-    <w:p>
-      <w:pPr>
-        <w:pStyle w:val="ListNumber"/>
-      </w:pPr>
-      <w:r>
-        <w:rPr>
-          <w:rFonts w:ascii="Times New Roman" w:hAnsi="Times New Roman"/>
-        </w:rPr>
-        <w:t>Integrar un flujo de preprocesado e inferencia con un modelo binario entrenado previamente.</w:t>
-      </w:r>
-    </w:p>
-    <w:p>
-      <w:pPr>
-        <w:pStyle w:val="ListNumber"/>
-      </w:pPr>
-      <w:r>
-        <w:rPr>
-          <w:rFonts w:ascii="Times New Roman" w:hAnsi="Times New Roman"/>
-        </w:rPr>
-        <w:t>Persistir evidencia tecnica suficiente en MongoDB sin almacenar por defecto mas datos sensibles de los estrictamente necesarios.</w:t>
-      </w:r>
-    </w:p>
-    <w:p>
-      <w:pPr>
-        <w:pStyle w:val="ListNumber"/>
-      </w:pPr>
-      <w:r>
-        <w:rPr>
-          <w:rFonts w:ascii="Times New Roman" w:hAnsi="Times New Roman"/>
-        </w:rPr>
-        <w:t xml:space="preserve">Versionar los artefactos de evaluacion por </w:t>
-      </w:r>
-      <w:r>
-        <w:rPr>
-          <w:rFonts w:ascii="Consolas" w:hAnsi="Consolas"/>
-          <w:sz w:val="20"/>
-        </w:rPr>
-        <w:t>run_id</w:t>
-      </w:r>
-      <w:r>
-        <w:rPr>
-          <w:rFonts w:ascii="Times New Roman" w:hAnsi="Times New Roman"/>
-        </w:rPr>
-        <w:t xml:space="preserve"> para mantener coherencia entre ejecuciones, metricas y endpoints.</w:t>
-      </w:r>
-    </w:p>
-    <w:p>
-      <w:pPr>
-        <w:pStyle w:val="ListNumber"/>
-      </w:pPr>
-      <w:r>
-        <w:rPr>
-          <w:rFonts w:ascii="Times New Roman" w:hAnsi="Times New Roman"/>
-        </w:rPr>
-        <w:t>Exponer resultados mediante una API reutilizable y visualizarlos en un dashboard web y en Grafana.</w:t>
-      </w:r>
-    </w:p>
-    <w:p>
-      <w:pPr>
-        <w:pStyle w:val="ListNumber"/>
-      </w:pPr>
-      <w:r>
-        <w:rPr>
-          <w:rFonts w:ascii="Times New Roman" w:hAnsi="Times New Roman"/>
-        </w:rPr>
-        <w:t>Validar el sistema con pruebas de API, evaluacion offline y casos simulados de integracion.</w:t>
-      </w:r>
-    </w:p>
-    <w:p>
-      <w:pPr>
-        <w:pStyle w:val="Heading2"/>
-      </w:pPr>
-      <w:r>
-        <w:rPr>
-          <w:rFonts w:ascii="Times New Roman" w:hAnsi="Times New Roman"/>
-        </w:rPr>
-        <w:t>1.3 Estructura del documento</w:t>
-      </w:r>
-    </w:p>
-    <w:p>
-      <w:r>
-        <w:rPr>
-          <w:rFonts w:ascii="Times New Roman" w:hAnsi="Times New Roman"/>
-          <w:sz w:val="24"/>
-        </w:rPr>
-        <w:t>La memoria se organiza en seis bloques. En primer lugar se presenta el contexto del problema y la justificacion tecnica del enfoque adoptado. A continuacion se describe la metodologia, la arquitectura y los requisitos. Despues se detalla el desarrollo del pipeline, la integracion entre componentes y las decisiones de almacenamiento y seguridad. Finalmente se analizan los resultados, las limitaciones detectadas y las conclusiones del trabajo.</w:t>
-      </w:r>
-    </w:p>
-    <w:p>
-      <w:pPr>
-        <w:pStyle w:val="Heading1"/>
-      </w:pPr>
-      <w:r>
-        <w:rPr>
-          <w:rFonts w:ascii="Times New Roman" w:hAnsi="Times New Roman"/>
-        </w:rPr>
-        <w:t>2. Contexto</w:t>
-      </w:r>
-    </w:p>
-    <w:p>
-      <w:pPr>
-        <w:pStyle w:val="Heading2"/>
-      </w:pPr>
-      <w:r>
-        <w:rPr>
-          <w:rFonts w:ascii="Times New Roman" w:hAnsi="Times New Roman"/>
-        </w:rPr>
-        <w:t>2.1 Telegram como superficie de interes en ciberseguridad</w:t>
-      </w:r>
-    </w:p>
-    <w:p>
-      <w:r>
-        <w:rPr>
-          <w:rFonts w:ascii="Times New Roman" w:hAnsi="Times New Roman"/>
-          <w:sz w:val="24"/>
-        </w:rPr>
-        <w:t>La literatura reciente y los informes del sector coinciden en que Telegram se ha consolidado como una fuente dual: sirve tanto para comunicaciones legitimas como para actividades ilicitas y de coordinacion criminal (Europol, 2022; Guo et al., 2024). Esa dualidad lo convierte en un espacio util para la inteligencia temprana en ciberseguridad.</w:t>
-      </w:r>
-    </w:p>
-    <w:p>
-      <w:r>
-        <w:rPr>
-          <w:rFonts w:ascii="Times New Roman" w:hAnsi="Times New Roman"/>
-          <w:sz w:val="24"/>
-        </w:rPr>
-        <w:t>Para una empresa, esto tiene una consecuencia clara: conviene disponer de mecanismos que permitan observar, filtrar y priorizar mensajes potencialmente peligrosos sin depender exclusivamente de la revision manual. De forma particular, el phishing sigue siendo una de las amenazas mas frecuentes y mas efectivas, por lo que detectar indicadores tempranos en mensajes o enlaces compartidos puede reducir el tiempo de reaccion.</w:t>
-      </w:r>
-    </w:p>
-    <w:p>
-      <w:pPr>
-        <w:pStyle w:val="Heading2"/>
-      </w:pPr>
-      <w:r>
-        <w:rPr>
-          <w:rFonts w:ascii="Times New Roman" w:hAnsi="Times New Roman"/>
-        </w:rPr>
-        <w:t>2.2 Necesidad de un enfoque de sistemas</w:t>
-      </w:r>
-    </w:p>
-    <w:p>
-      <w:r>
-        <w:rPr>
-          <w:rFonts w:ascii="Times New Roman" w:hAnsi="Times New Roman"/>
-          <w:sz w:val="24"/>
-        </w:rPr>
-        <w:t>En este trabajo no basta con responder si un mensaje parece benigno o sospechoso. La pregunta relevante es mas amplia:</w:t>
-      </w:r>
-    </w:p>
-    <w:p>
-      <w:pPr>
-        <w:pStyle w:val="ListBullet"/>
-      </w:pPr>
-      <w:r>
-        <w:rPr>
-          <w:rFonts w:ascii="Times New Roman" w:hAnsi="Times New Roman"/>
-        </w:rPr>
-        <w:t>como llega el mensaje al sistema;</w:t>
-      </w:r>
-    </w:p>
-    <w:p>
-      <w:pPr>
-        <w:pStyle w:val="ListBullet"/>
-      </w:pPr>
-      <w:r>
-        <w:rPr>
-          <w:rFonts w:ascii="Times New Roman" w:hAnsi="Times New Roman"/>
-        </w:rPr>
-        <w:t>como se procesa y clasifica;</w:t>
-      </w:r>
-    </w:p>
-    <w:p>
-      <w:pPr>
-        <w:pStyle w:val="ListBullet"/>
-      </w:pPr>
-      <w:r>
-        <w:rPr>
-          <w:rFonts w:ascii="Times New Roman" w:hAnsi="Times New Roman"/>
-        </w:rPr>
-        <w:t>que datos se conservan;</w:t>
-      </w:r>
-    </w:p>
-    <w:p>
-      <w:pPr>
-        <w:pStyle w:val="ListBullet"/>
-      </w:pPr>
-      <w:r>
-        <w:rPr>
-          <w:rFonts w:ascii="Times New Roman" w:hAnsi="Times New Roman"/>
-        </w:rPr>
-        <w:t>como se audita la ejecucion;</w:t>
-      </w:r>
-    </w:p>
-    <w:p>
-      <w:pPr>
-        <w:pStyle w:val="ListBullet"/>
-      </w:pPr>
-      <w:r>
-        <w:rPr>
-          <w:rFonts w:ascii="Times New Roman" w:hAnsi="Times New Roman"/>
-        </w:rPr>
-        <w:t>como se consumen los resultados desde otros componentes.</w:t>
-      </w:r>
-    </w:p>
-    <w:p>
-      <w:r>
-        <w:rPr>
-          <w:rFonts w:ascii="Times New Roman" w:hAnsi="Times New Roman"/>
-          <w:sz w:val="24"/>
-        </w:rPr>
-        <w:t>Estas preguntas obligan a pensar el problema como un pipeline de sistemas. Por eso, el proyecto no se ha orientado solo a la mejora de un clasificador, sino al ensamblaje de varios modulos coordinados que permitan desplegar la solucion, validarla y operarla.</w:t>
-      </w:r>
-    </w:p>
-    <w:p>
-      <w:pPr>
-        <w:pStyle w:val="Heading2"/>
-      </w:pPr>
-      <w:r>
-        <w:rPr>
-          <w:rFonts w:ascii="Times New Roman" w:hAnsi="Times New Roman"/>
-        </w:rPr>
-        <w:t>2.3 Soluciones relacionadas y hueco del proyecto</w:t>
-      </w:r>
-    </w:p>
-    <w:p>
-      <w:r>
-        <w:rPr>
-          <w:rFonts w:ascii="Times New Roman" w:hAnsi="Times New Roman"/>
-          <w:sz w:val="24"/>
-        </w:rPr>
-        <w:t>Existen soluciones comerciales y academicas para monitorizar fuentes abiertas, orquestar indicadores o aplicar modelos de lenguaje a ciberseguridad. Sin embargo, muchas de esas soluciones son generalistas, costosas o estan poco centradas en una integracion ligera y modular sobre Telegram. El hueco que cubre este TFG consiste en demostrar una arquitectura defendible, con tecnologias accesibles y con especial atencion a:</w:t>
-      </w:r>
-    </w:p>
-    <w:p>
-      <w:pPr>
-        <w:pStyle w:val="ListBullet"/>
-      </w:pPr>
-      <w:r>
-        <w:rPr>
-          <w:rFonts w:ascii="Times New Roman" w:hAnsi="Times New Roman"/>
-        </w:rPr>
-        <w:t>portabilidad mediante Docker;</w:t>
-      </w:r>
-    </w:p>
-    <w:p>
-      <w:pPr>
-        <w:pStyle w:val="ListBullet"/>
-      </w:pPr>
-      <w:r>
-        <w:rPr>
-          <w:rFonts w:ascii="Times New Roman" w:hAnsi="Times New Roman"/>
-        </w:rPr>
-        <w:t>almacenamiento flexible en MongoDB;</w:t>
-      </w:r>
-    </w:p>
-    <w:p>
-      <w:pPr>
-        <w:pStyle w:val="ListBullet"/>
-      </w:pPr>
-      <w:r>
-        <w:rPr>
-          <w:rFonts w:ascii="Times New Roman" w:hAnsi="Times New Roman"/>
-        </w:rPr>
-        <w:t>interfaz de consulta basada en API;</w:t>
-      </w:r>
-    </w:p>
-    <w:p>
-      <w:pPr>
-        <w:pStyle w:val="ListBullet"/>
-      </w:pPr>
-      <w:r>
-        <w:rPr>
-          <w:rFonts w:ascii="Times New Roman" w:hAnsi="Times New Roman"/>
-        </w:rPr>
-        <w:t>capa ligera de visualizacion;</w:t>
-      </w:r>
-    </w:p>
-    <w:p>
-      <w:pPr>
-        <w:pStyle w:val="ListBullet"/>
-      </w:pPr>
-      <w:r>
-        <w:rPr>
-          <w:rFonts w:ascii="Times New Roman" w:hAnsi="Times New Roman"/>
-        </w:rPr>
-        <w:t>trazabilidad por ejecucion.</w:t>
-      </w:r>
-    </w:p>
-    <w:p>
-      <w:pPr>
-        <w:pStyle w:val="Heading2"/>
-      </w:pPr>
-      <w:r>
-        <w:rPr>
-          <w:rFonts w:ascii="Times New Roman" w:hAnsi="Times New Roman"/>
-        </w:rPr>
-        <w:t>2.4 Criterio de seguridad minima</w:t>
-      </w:r>
-    </w:p>
-    <w:p>
-      <w:r>
-        <w:rPr>
-          <w:rFonts w:ascii="Times New Roman" w:hAnsi="Times New Roman"/>
-          <w:sz w:val="24"/>
-        </w:rPr>
-        <w:t>La revision de tutoria obligo a reforzar el sistema en un aspecto importante: la explotacion minima segura. A partir de esa revision se fijaron cinco criterios:</w:t>
-      </w:r>
-    </w:p>
-    <w:p>
-      <w:pPr>
-        <w:pStyle w:val="ListNumber"/>
-      </w:pPr>
-      <w:r>
-        <w:rPr>
-          <w:rFonts w:ascii="Times New Roman" w:hAnsi="Times New Roman"/>
-        </w:rPr>
-        <w:t>no publicar MongoDB al exterior por defecto;</w:t>
-      </w:r>
-    </w:p>
-    <w:p>
-      <w:pPr>
-        <w:pStyle w:val="ListNumber"/>
-      </w:pPr>
-      <w:r>
-        <w:rPr>
-          <w:rFonts w:ascii="Times New Roman" w:hAnsi="Times New Roman"/>
-        </w:rPr>
-        <w:t>exigir autenticacion simple en la API;</w:t>
-      </w:r>
-    </w:p>
-    <w:p>
-      <w:pPr>
-        <w:pStyle w:val="ListNumber"/>
-      </w:pPr>
-      <w:r>
-        <w:rPr>
-          <w:rFonts w:ascii="Times New Roman" w:hAnsi="Times New Roman"/>
-        </w:rPr>
-        <w:t>desactivar acceso anonimo en Grafana;</w:t>
-      </w:r>
-    </w:p>
-    <w:p>
-      <w:pPr>
-        <w:pStyle w:val="ListNumber"/>
-      </w:pPr>
-      <w:r>
-        <w:rPr>
-          <w:rFonts w:ascii="Times New Roman" w:hAnsi="Times New Roman"/>
-        </w:rPr>
-        <w:t>restringir CORS a origenes concretos;</w:t>
-      </w:r>
-    </w:p>
-    <w:p>
-      <w:pPr>
-        <w:pStyle w:val="ListNumber"/>
-      </w:pPr>
-      <w:r>
-        <w:rPr>
-          <w:rFonts w:ascii="Times New Roman" w:hAnsi="Times New Roman"/>
-        </w:rPr>
-        <w:t>minimizar los datos personales o textuales persistidos en MongoDB.</w:t>
-      </w:r>
-    </w:p>
-    <w:p>
-      <w:r>
-        <w:rPr>
-          <w:rFonts w:ascii="Times New Roman" w:hAnsi="Times New Roman"/>
-          <w:sz w:val="24"/>
-        </w:rPr>
-        <w:t>Este conjunto de decisiones no convierte el sistema en una plataforma final de produccion, pero si lo hace mas coherente y defendible desde el punto de vista tecnico.</w:t>
-      </w:r>
-    </w:p>
-    <w:p>
-      <w:pPr>
-        <w:pStyle w:val="Heading1"/>
-      </w:pPr>
-      <w:r>
-        <w:rPr>
-          <w:rFonts w:ascii="Times New Roman" w:hAnsi="Times New Roman"/>
-        </w:rPr>
-        <w:t>3. Descripcion informatica</w:t>
+        </w:rPr>
+        <w:t>3. Metodologia, requisitos y arquitectura</w:t>
       </w:r>
     </w:p>
     <w:p>
@@ -1152,7 +1208,7 @@
         <w:rPr>
           <w:rFonts w:ascii="Times New Roman" w:hAnsi="Times New Roman"/>
         </w:rPr>
-        <w:t>3.4 Arquitectura general</w:t>
+        <w:t>3.4 Arquitectura general del pipeline</w:t>
       </w:r>
     </w:p>
     <w:p>
@@ -1867,7 +1923,7 @@
         <w:rPr>
           <w:rFonts w:ascii="Times New Roman" w:hAnsi="Times New Roman"/>
         </w:rPr>
-        <w:t>4. Desarrollo del sistema</w:t>
+        <w:t>4. Desarrollo e integracion del sistema</w:t>
       </w:r>
     </w:p>
     <w:p>
@@ -2643,17 +2699,40 @@
       </w:r>
     </w:p>
     <w:p>
-      <w:pPr>
-        <w:jc w:val="center"/>
-      </w:pPr>
       <w:r>
         <w:rPr>
           <w:rFonts w:ascii="Times New Roman" w:hAnsi="Times New Roman"/>
           <w:sz w:val="24"/>
         </w:rPr>
+        <w:t xml:space="preserve">Ademas del resumen ejecutivo y la vista de mensajes, el dashboard incorpora una pantalla de rendimiento que facilita revisar la evolucion de las metricas principales y contrastarlas con los artefactos de evaluacion generados por </w:t>
+      </w:r>
+      <w:r>
+        <w:rPr>
+          <w:rFonts w:ascii="Consolas" w:hAnsi="Consolas"/>
+          <w:sz w:val="20"/>
+        </w:rPr>
+        <w:t>run_id</w:t>
+      </w:r>
+      <w:r>
+        <w:rPr>
+          <w:rFonts w:ascii="Times New Roman" w:hAnsi="Times New Roman"/>
+          <w:sz w:val="24"/>
+        </w:rPr>
+        <w:t>.</w:t>
+      </w:r>
+    </w:p>
+    <w:p>
+      <w:pPr>
+        <w:jc w:val="center"/>
+      </w:pPr>
+      <w:r>
+        <w:rPr>
+          <w:rFonts w:ascii="Times New Roman" w:hAnsi="Times New Roman"/>
+          <w:sz w:val="24"/>
+        </w:rPr>
         <w:drawing>
           <wp:inline xmlns:a="http://schemas.openxmlformats.org/drawingml/2006/main" xmlns:pic="http://schemas.openxmlformats.org/drawingml/2006/picture">
-            <wp:extent cx="5580000" cy="3348000"/>
+            <wp:extent cx="5580000" cy="3138750"/>
             <wp:docPr id="5" name="Picture 5"/>
             <wp:cNvGraphicFramePr>
               <a:graphicFrameLocks noChangeAspect="1"/>
@@ -2662,7 +2741,7 @@
               <a:graphicData uri="http://schemas.openxmlformats.org/drawingml/2006/picture">
                 <pic:pic>
                   <pic:nvPicPr>
-                    <pic:cNvPr id="0" name="ui_grafana_mvp.png"/>
+                    <pic:cNvPr id="0" name="ui_react_rendimiento.png"/>
                     <pic:cNvPicPr/>
                   </pic:nvPicPr>
                   <pic:blipFill>
@@ -2674,7 +2753,7 @@
                   <pic:spPr>
                     <a:xfrm>
                       <a:off x="0" y="0"/>
-                      <a:ext cx="5580000" cy="3348000"/>
+                      <a:ext cx="5580000" cy="3138750"/>
                     </a:xfrm>
                     <a:prstGeom prst="rect"/>
                   </pic:spPr>
@@ -2695,296 +2774,7 @@
           <w:i/>
           <w:sz w:val="22"/>
         </w:rPr>
-        <w:t>Figura 5. Panel de Grafana configurado para monitorizacion complementaria del MVP.</w:t>
-      </w:r>
-    </w:p>
-    <w:p>
-      <w:r>
-        <w:rPr>
-          <w:rFonts w:ascii="Times New Roman" w:hAnsi="Times New Roman"/>
-          <w:sz w:val="24"/>
-        </w:rPr>
-        <w:t>La coexistencia de ambas capas refuerza la idea de pipeline explotable: la API sirve como contrato tecnico comun, React se orienta a revision funcional y Grafana a observabilidad.</w:t>
-      </w:r>
-    </w:p>
-    <w:p>
-      <w:pPr>
-        <w:pStyle w:val="Heading2"/>
-      </w:pPr>
-      <w:r>
-        <w:rPr>
-          <w:rFonts w:ascii="Times New Roman" w:hAnsi="Times New Roman"/>
-        </w:rPr>
-        <w:t>4.7 Validacion integrada</w:t>
-      </w:r>
-    </w:p>
-    <w:p>
-      <w:r>
-        <w:rPr>
-          <w:rFonts w:ascii="Times New Roman" w:hAnsi="Times New Roman"/>
-          <w:sz w:val="24"/>
-        </w:rPr>
-        <w:t>El proyecto incorpora varios niveles de verificacion:</w:t>
-      </w:r>
-    </w:p>
-    <w:p>
-      <w:pPr>
-        <w:pStyle w:val="ListBullet"/>
-      </w:pPr>
-      <w:r>
-        <w:rPr>
-          <w:rFonts w:ascii="Times New Roman" w:hAnsi="Times New Roman"/>
-        </w:rPr>
-        <w:t xml:space="preserve">pruebas </w:t>
-      </w:r>
-      <w:r>
-        <w:rPr>
-          <w:rFonts w:ascii="Consolas" w:hAnsi="Consolas"/>
-          <w:sz w:val="20"/>
-        </w:rPr>
-        <w:t>pytest</w:t>
-      </w:r>
-      <w:r>
-        <w:rPr>
-          <w:rFonts w:ascii="Times New Roman" w:hAnsi="Times New Roman"/>
-        </w:rPr>
-        <w:t xml:space="preserve"> para la API;</w:t>
-      </w:r>
-    </w:p>
-    <w:p>
-      <w:pPr>
-        <w:pStyle w:val="ListBullet"/>
-      </w:pPr>
-      <w:r>
-        <w:rPr>
-          <w:rFonts w:ascii="Times New Roman" w:hAnsi="Times New Roman"/>
-        </w:rPr>
-        <w:t>evaluacion offline reproducible;</w:t>
-      </w:r>
-    </w:p>
-    <w:p>
-      <w:pPr>
-        <w:pStyle w:val="ListBullet"/>
-      </w:pPr>
-      <w:r>
-        <w:rPr>
-          <w:rFonts w:ascii="Times New Roman" w:hAnsi="Times New Roman"/>
-        </w:rPr>
-        <w:t xml:space="preserve">simulacion de casos operativos con </w:t>
-      </w:r>
-      <w:r>
-        <w:rPr>
-          <w:rFonts w:ascii="Consolas" w:hAnsi="Consolas"/>
-          <w:sz w:val="20"/>
-        </w:rPr>
-        <w:t>scripts/simulate_cases.py</w:t>
-      </w:r>
-      <w:r>
-        <w:rPr>
-          <w:rFonts w:ascii="Times New Roman" w:hAnsi="Times New Roman"/>
-        </w:rPr>
-        <w:t>;</w:t>
-      </w:r>
-    </w:p>
-    <w:p>
-      <w:pPr>
-        <w:pStyle w:val="ListBullet"/>
-      </w:pPr>
-      <w:r>
-        <w:rPr>
-          <w:rFonts w:ascii="Times New Roman" w:hAnsi="Times New Roman"/>
-        </w:rPr>
-        <w:t xml:space="preserve">runner de integracion con </w:t>
-      </w:r>
-      <w:r>
-        <w:rPr>
-          <w:rFonts w:ascii="Consolas" w:hAnsi="Consolas"/>
-          <w:sz w:val="20"/>
-        </w:rPr>
-        <w:t>scripts/run_phase5_checks.py</w:t>
-      </w:r>
-      <w:r>
-        <w:rPr>
-          <w:rFonts w:ascii="Times New Roman" w:hAnsi="Times New Roman"/>
-        </w:rPr>
-        <w:t>.</w:t>
-      </w:r>
-    </w:p>
-    <w:p>
-      <w:r>
-        <w:rPr>
-          <w:rFonts w:ascii="Times New Roman" w:hAnsi="Times New Roman"/>
-          <w:sz w:val="24"/>
-        </w:rPr>
-        <w:t xml:space="preserve">La observacion practica de tutoria sobre </w:t>
-      </w:r>
-      <w:r>
-        <w:rPr>
-          <w:rFonts w:ascii="Consolas" w:hAnsi="Consolas"/>
-          <w:sz w:val="20"/>
-        </w:rPr>
-        <w:t>pytest -q</w:t>
-      </w:r>
-      <w:r>
-        <w:rPr>
-          <w:rFonts w:ascii="Times New Roman" w:hAnsi="Times New Roman"/>
-          <w:sz w:val="24"/>
-        </w:rPr>
-        <w:t xml:space="preserve"> frente a </w:t>
-      </w:r>
-      <w:r>
-        <w:rPr>
-          <w:rFonts w:ascii="Consolas" w:hAnsi="Consolas"/>
-          <w:sz w:val="20"/>
-        </w:rPr>
-        <w:t>python -m pytest -q</w:t>
-      </w:r>
-      <w:r>
-        <w:rPr>
-          <w:rFonts w:ascii="Times New Roman" w:hAnsi="Times New Roman"/>
-          <w:sz w:val="24"/>
-        </w:rPr>
-        <w:t xml:space="preserve"> ha quedado resuelta con </w:t>
-      </w:r>
-      <w:r>
-        <w:rPr>
-          <w:rFonts w:ascii="Consolas" w:hAnsi="Consolas"/>
-          <w:sz w:val="20"/>
-        </w:rPr>
-        <w:t>pytest.ini</w:t>
-      </w:r>
-      <w:r>
-        <w:rPr>
-          <w:rFonts w:ascii="Times New Roman" w:hAnsi="Times New Roman"/>
-          <w:sz w:val="24"/>
-        </w:rPr>
-        <w:t>, de forma que ambas formas de ejecucion funcionan correctamente sobre el proyecto.</w:t>
-      </w:r>
-    </w:p>
-    <w:p>
-      <w:pPr>
-        <w:pStyle w:val="Heading1"/>
-      </w:pPr>
-      <w:r>
-        <w:rPr>
-          <w:rFonts w:ascii="Times New Roman" w:hAnsi="Times New Roman"/>
-        </w:rPr>
-        <w:t>5. Evaluacion de resultados</w:t>
-      </w:r>
-    </w:p>
-    <w:p>
-      <w:pPr>
-        <w:pStyle w:val="Heading2"/>
-      </w:pPr>
-      <w:r>
-        <w:rPr>
-          <w:rFonts w:ascii="Times New Roman" w:hAnsi="Times New Roman"/>
-        </w:rPr>
-        <w:t>5.1 Metricas principales</w:t>
-      </w:r>
-    </w:p>
-    <w:p>
-      <w:r>
-        <w:rPr>
-          <w:rFonts w:ascii="Times New Roman" w:hAnsi="Times New Roman"/>
-          <w:sz w:val="24"/>
-        </w:rPr>
-        <w:t xml:space="preserve">La evaluacion offline mas reciente, almacenada en </w:t>
-      </w:r>
-      <w:r>
-        <w:rPr>
-          <w:rFonts w:ascii="Consolas" w:hAnsi="Consolas"/>
-          <w:sz w:val="20"/>
-        </w:rPr>
-        <w:t>reports/metrics.json</w:t>
-      </w:r>
-      <w:r>
-        <w:rPr>
-          <w:rFonts w:ascii="Times New Roman" w:hAnsi="Times New Roman"/>
-          <w:sz w:val="24"/>
-        </w:rPr>
-        <w:t>, ofrece los siguientes resultados sobre 100 muestras balanceadas:</w:t>
-      </w:r>
-    </w:p>
-    <w:p>
-      <w:pPr>
-        <w:pStyle w:val="ListBullet"/>
-      </w:pPr>
-      <w:r>
-        <w:rPr>
-          <w:rFonts w:ascii="Consolas" w:hAnsi="Consolas"/>
-          <w:sz w:val="20"/>
-        </w:rPr>
-        <w:t>accuracy = 0.63</w:t>
-      </w:r>
-    </w:p>
-    <w:p>
-      <w:pPr>
-        <w:pStyle w:val="ListBullet"/>
-      </w:pPr>
-      <w:r>
-        <w:rPr>
-          <w:rFonts w:ascii="Consolas" w:hAnsi="Consolas"/>
-          <w:sz w:val="20"/>
-        </w:rPr>
-        <w:t>precision_pos = 0.5823</w:t>
-      </w:r>
-    </w:p>
-    <w:p>
-      <w:pPr>
-        <w:pStyle w:val="ListBullet"/>
-      </w:pPr>
-      <w:r>
-        <w:rPr>
-          <w:rFonts w:ascii="Consolas" w:hAnsi="Consolas"/>
-          <w:sz w:val="20"/>
-        </w:rPr>
-        <w:t>recall_pos = 0.92</w:t>
-      </w:r>
-    </w:p>
-    <w:p>
-      <w:pPr>
-        <w:pStyle w:val="ListBullet"/>
-      </w:pPr>
-      <w:r>
-        <w:rPr>
-          <w:rFonts w:ascii="Consolas" w:hAnsi="Consolas"/>
-          <w:sz w:val="20"/>
-        </w:rPr>
-        <w:t>f1_pos = 0.7132</w:t>
-      </w:r>
-    </w:p>
-    <w:p>
-      <w:pPr>
-        <w:pStyle w:val="ListBullet"/>
-      </w:pPr>
-      <w:r>
-        <w:rPr>
-          <w:rFonts w:ascii="Consolas" w:hAnsi="Consolas"/>
-          <w:sz w:val="20"/>
-        </w:rPr>
-        <w:t>roc_auc = 0.8684</w:t>
-      </w:r>
-    </w:p>
-    <w:p>
-      <w:pPr>
-        <w:pStyle w:val="ListBullet"/>
-      </w:pPr>
-      <w:r>
-        <w:rPr>
-          <w:rFonts w:ascii="Consolas" w:hAnsi="Consolas"/>
-          <w:sz w:val="20"/>
-        </w:rPr>
-        <w:t>average_precision = 0.8951</w:t>
-      </w:r>
-    </w:p>
-    <w:p>
-      <w:r>
-        <w:rPr>
-          <w:rFonts w:ascii="Times New Roman" w:hAnsi="Times New Roman"/>
-          <w:sz w:val="24"/>
-        </w:rPr>
-        <w:t>Estos valores muestran un comportamiento coherente con la filosofia del sistema: se acepta una precision moderada para maximizar la capacidad de deteccion temprana de amenazas reales.</w:t>
+        <w:t>Figura 5. Vista del dashboard React orientada al seguimiento del rendimiento y las metricas del sistema.</w:t>
       </w:r>
     </w:p>
     <w:p>
@@ -3007,7 +2797,7 @@
               <a:graphicData uri="http://schemas.openxmlformats.org/drawingml/2006/picture">
                 <pic:pic>
                   <pic:nvPicPr>
-                    <pic:cNvPr id="0" name="fig01_curva_umbral.png"/>
+                    <pic:cNvPr id="0" name="ui_grafana_mvp.png"/>
                     <pic:cNvPicPr/>
                   </pic:nvPicPr>
                   <pic:blipFill>
@@ -3040,7 +2830,352 @@
           <w:i/>
           <w:sz w:val="22"/>
         </w:rPr>
-        <w:t>Figura 6. Analisis por umbral utilizado para comparar precision, recall, F1 y accuracy.</w:t>
+        <w:t>Figura 6. Panel de Grafana configurado para monitorizacion complementaria del MVP.</w:t>
+      </w:r>
+    </w:p>
+    <w:p>
+      <w:r>
+        <w:rPr>
+          <w:rFonts w:ascii="Times New Roman" w:hAnsi="Times New Roman"/>
+          <w:sz w:val="24"/>
+        </w:rPr>
+        <w:t>La coexistencia de ambas capas refuerza la idea de pipeline explotable: la API sirve como contrato tecnico comun, React se orienta a revision funcional y Grafana a observabilidad.</w:t>
+      </w:r>
+    </w:p>
+    <w:p>
+      <w:pPr>
+        <w:pStyle w:val="Heading2"/>
+      </w:pPr>
+      <w:r>
+        <w:rPr>
+          <w:rFonts w:ascii="Times New Roman" w:hAnsi="Times New Roman"/>
+        </w:rPr>
+        <w:t>4.7 Validacion integrada</w:t>
+      </w:r>
+    </w:p>
+    <w:p>
+      <w:r>
+        <w:rPr>
+          <w:rFonts w:ascii="Times New Roman" w:hAnsi="Times New Roman"/>
+          <w:sz w:val="24"/>
+        </w:rPr>
+        <w:t>El proyecto incorpora varios niveles de verificacion:</w:t>
+      </w:r>
+    </w:p>
+    <w:p>
+      <w:pPr>
+        <w:pStyle w:val="ListBullet"/>
+      </w:pPr>
+      <w:r>
+        <w:rPr>
+          <w:rFonts w:ascii="Times New Roman" w:hAnsi="Times New Roman"/>
+        </w:rPr>
+        <w:t xml:space="preserve">pruebas </w:t>
+      </w:r>
+      <w:r>
+        <w:rPr>
+          <w:rFonts w:ascii="Consolas" w:hAnsi="Consolas"/>
+          <w:sz w:val="20"/>
+        </w:rPr>
+        <w:t>pytest</w:t>
+      </w:r>
+      <w:r>
+        <w:rPr>
+          <w:rFonts w:ascii="Times New Roman" w:hAnsi="Times New Roman"/>
+        </w:rPr>
+        <w:t xml:space="preserve"> para la API;</w:t>
+      </w:r>
+    </w:p>
+    <w:p>
+      <w:pPr>
+        <w:pStyle w:val="ListBullet"/>
+      </w:pPr>
+      <w:r>
+        <w:rPr>
+          <w:rFonts w:ascii="Times New Roman" w:hAnsi="Times New Roman"/>
+        </w:rPr>
+        <w:t>evaluacion offline reproducible;</w:t>
+      </w:r>
+    </w:p>
+    <w:p>
+      <w:pPr>
+        <w:pStyle w:val="ListBullet"/>
+      </w:pPr>
+      <w:r>
+        <w:rPr>
+          <w:rFonts w:ascii="Times New Roman" w:hAnsi="Times New Roman"/>
+        </w:rPr>
+        <w:t xml:space="preserve">simulacion de casos operativos con </w:t>
+      </w:r>
+      <w:r>
+        <w:rPr>
+          <w:rFonts w:ascii="Consolas" w:hAnsi="Consolas"/>
+          <w:sz w:val="20"/>
+        </w:rPr>
+        <w:t>scripts/simulate_cases.py</w:t>
+      </w:r>
+      <w:r>
+        <w:rPr>
+          <w:rFonts w:ascii="Times New Roman" w:hAnsi="Times New Roman"/>
+        </w:rPr>
+        <w:t>;</w:t>
+      </w:r>
+    </w:p>
+    <w:p>
+      <w:pPr>
+        <w:pStyle w:val="ListBullet"/>
+      </w:pPr>
+      <w:r>
+        <w:rPr>
+          <w:rFonts w:ascii="Times New Roman" w:hAnsi="Times New Roman"/>
+        </w:rPr>
+        <w:t xml:space="preserve">runner de integracion con </w:t>
+      </w:r>
+      <w:r>
+        <w:rPr>
+          <w:rFonts w:ascii="Consolas" w:hAnsi="Consolas"/>
+          <w:sz w:val="20"/>
+        </w:rPr>
+        <w:t>scripts/run_phase5_checks.py</w:t>
+      </w:r>
+      <w:r>
+        <w:rPr>
+          <w:rFonts w:ascii="Times New Roman" w:hAnsi="Times New Roman"/>
+        </w:rPr>
+        <w:t>.</w:t>
+      </w:r>
+    </w:p>
+    <w:p>
+      <w:r>
+        <w:rPr>
+          <w:rFonts w:ascii="Times New Roman" w:hAnsi="Times New Roman"/>
+          <w:sz w:val="24"/>
+        </w:rPr>
+        <w:t xml:space="preserve">La observacion practica de tutoria sobre </w:t>
+      </w:r>
+      <w:r>
+        <w:rPr>
+          <w:rFonts w:ascii="Consolas" w:hAnsi="Consolas"/>
+          <w:sz w:val="20"/>
+        </w:rPr>
+        <w:t>pytest -q</w:t>
+      </w:r>
+      <w:r>
+        <w:rPr>
+          <w:rFonts w:ascii="Times New Roman" w:hAnsi="Times New Roman"/>
+          <w:sz w:val="24"/>
+        </w:rPr>
+        <w:t xml:space="preserve"> frente a </w:t>
+      </w:r>
+      <w:r>
+        <w:rPr>
+          <w:rFonts w:ascii="Consolas" w:hAnsi="Consolas"/>
+          <w:sz w:val="20"/>
+        </w:rPr>
+        <w:t>python -m pytest -q</w:t>
+      </w:r>
+      <w:r>
+        <w:rPr>
+          <w:rFonts w:ascii="Times New Roman" w:hAnsi="Times New Roman"/>
+          <w:sz w:val="24"/>
+        </w:rPr>
+        <w:t xml:space="preserve"> ha quedado resuelta con </w:t>
+      </w:r>
+      <w:r>
+        <w:rPr>
+          <w:rFonts w:ascii="Consolas" w:hAnsi="Consolas"/>
+          <w:sz w:val="20"/>
+        </w:rPr>
+        <w:t>pytest.ini</w:t>
+      </w:r>
+      <w:r>
+        <w:rPr>
+          <w:rFonts w:ascii="Times New Roman" w:hAnsi="Times New Roman"/>
+          <w:sz w:val="24"/>
+        </w:rPr>
+        <w:t>, de forma que ambas formas de ejecucion funcionan correctamente sobre el proyecto.</w:t>
+      </w:r>
+    </w:p>
+    <w:p>
+      <w:pPr>
+        <w:pStyle w:val="Heading1"/>
+      </w:pPr>
+      <w:r>
+        <w:rPr>
+          <w:rFonts w:ascii="Times New Roman" w:hAnsi="Times New Roman"/>
+        </w:rPr>
+        <w:t>5. Evaluacion y analisis de resultados</w:t>
+      </w:r>
+    </w:p>
+    <w:p>
+      <w:pPr>
+        <w:pStyle w:val="Heading2"/>
+      </w:pPr>
+      <w:r>
+        <w:rPr>
+          <w:rFonts w:ascii="Times New Roman" w:hAnsi="Times New Roman"/>
+        </w:rPr>
+        <w:t>5.1 Metricas principales</w:t>
+      </w:r>
+    </w:p>
+    <w:p>
+      <w:r>
+        <w:rPr>
+          <w:rFonts w:ascii="Times New Roman" w:hAnsi="Times New Roman"/>
+          <w:sz w:val="24"/>
+        </w:rPr>
+        <w:t xml:space="preserve">La evaluacion offline mas reciente, almacenada en </w:t>
+      </w:r>
+      <w:r>
+        <w:rPr>
+          <w:rFonts w:ascii="Consolas" w:hAnsi="Consolas"/>
+          <w:sz w:val="20"/>
+        </w:rPr>
+        <w:t>reports/metrics.json</w:t>
+      </w:r>
+      <w:r>
+        <w:rPr>
+          <w:rFonts w:ascii="Times New Roman" w:hAnsi="Times New Roman"/>
+          <w:sz w:val="24"/>
+        </w:rPr>
+        <w:t>, ofrece los siguientes resultados sobre 100 muestras balanceadas:</w:t>
+      </w:r>
+    </w:p>
+    <w:p>
+      <w:pPr>
+        <w:pStyle w:val="ListBullet"/>
+      </w:pPr>
+      <w:r>
+        <w:rPr>
+          <w:rFonts w:ascii="Consolas" w:hAnsi="Consolas"/>
+          <w:sz w:val="20"/>
+        </w:rPr>
+        <w:t>accuracy = 0.63</w:t>
+      </w:r>
+    </w:p>
+    <w:p>
+      <w:pPr>
+        <w:pStyle w:val="ListBullet"/>
+      </w:pPr>
+      <w:r>
+        <w:rPr>
+          <w:rFonts w:ascii="Consolas" w:hAnsi="Consolas"/>
+          <w:sz w:val="20"/>
+        </w:rPr>
+        <w:t>precision_pos = 0.5823</w:t>
+      </w:r>
+    </w:p>
+    <w:p>
+      <w:pPr>
+        <w:pStyle w:val="ListBullet"/>
+      </w:pPr>
+      <w:r>
+        <w:rPr>
+          <w:rFonts w:ascii="Consolas" w:hAnsi="Consolas"/>
+          <w:sz w:val="20"/>
+        </w:rPr>
+        <w:t>recall_pos = 0.92</w:t>
+      </w:r>
+    </w:p>
+    <w:p>
+      <w:pPr>
+        <w:pStyle w:val="ListBullet"/>
+      </w:pPr>
+      <w:r>
+        <w:rPr>
+          <w:rFonts w:ascii="Consolas" w:hAnsi="Consolas"/>
+          <w:sz w:val="20"/>
+        </w:rPr>
+        <w:t>f1_pos = 0.7132</w:t>
+      </w:r>
+    </w:p>
+    <w:p>
+      <w:pPr>
+        <w:pStyle w:val="ListBullet"/>
+      </w:pPr>
+      <w:r>
+        <w:rPr>
+          <w:rFonts w:ascii="Consolas" w:hAnsi="Consolas"/>
+          <w:sz w:val="20"/>
+        </w:rPr>
+        <w:t>roc_auc = 0.8684</w:t>
+      </w:r>
+    </w:p>
+    <w:p>
+      <w:pPr>
+        <w:pStyle w:val="ListBullet"/>
+      </w:pPr>
+      <w:r>
+        <w:rPr>
+          <w:rFonts w:ascii="Consolas" w:hAnsi="Consolas"/>
+          <w:sz w:val="20"/>
+        </w:rPr>
+        <w:t>average_precision = 0.8951</w:t>
+      </w:r>
+    </w:p>
+    <w:p>
+      <w:r>
+        <w:rPr>
+          <w:rFonts w:ascii="Times New Roman" w:hAnsi="Times New Roman"/>
+          <w:sz w:val="24"/>
+        </w:rPr>
+        <w:t>Estos valores muestran un comportamiento coherente con la filosofia del sistema: se acepta una precision moderada para maximizar la capacidad de deteccion temprana de amenazas reales.</w:t>
+      </w:r>
+    </w:p>
+    <w:p>
+      <w:pPr>
+        <w:jc w:val="center"/>
+      </w:pPr>
+      <w:r>
+        <w:rPr>
+          <w:rFonts w:ascii="Times New Roman" w:hAnsi="Times New Roman"/>
+          <w:sz w:val="24"/>
+        </w:rPr>
+        <w:drawing>
+          <wp:inline xmlns:a="http://schemas.openxmlformats.org/drawingml/2006/main" xmlns:pic="http://schemas.openxmlformats.org/drawingml/2006/picture">
+            <wp:extent cx="5580000" cy="3348000"/>
+            <wp:docPr id="7" name="Picture 7"/>
+            <wp:cNvGraphicFramePr>
+              <a:graphicFrameLocks noChangeAspect="1"/>
+            </wp:cNvGraphicFramePr>
+            <a:graphic>
+              <a:graphicData uri="http://schemas.openxmlformats.org/drawingml/2006/picture">
+                <pic:pic>
+                  <pic:nvPicPr>
+                    <pic:cNvPr id="0" name="fig01_curva_umbral.png"/>
+                    <pic:cNvPicPr/>
+                  </pic:nvPicPr>
+                  <pic:blipFill>
+                    <a:blip r:embed="rId17"/>
+                    <a:stretch>
+                      <a:fillRect/>
+                    </a:stretch>
+                  </pic:blipFill>
+                  <pic:spPr>
+                    <a:xfrm>
+                      <a:off x="0" y="0"/>
+                      <a:ext cx="5580000" cy="3348000"/>
+                    </a:xfrm>
+                    <a:prstGeom prst="rect"/>
+                  </pic:spPr>
+                </pic:pic>
+              </a:graphicData>
+            </a:graphic>
+          </wp:inline>
+        </w:drawing>
+      </w:r>
+    </w:p>
+    <w:p>
+      <w:pPr>
+        <w:jc w:val="center"/>
+      </w:pPr>
+      <w:r>
+        <w:rPr>
+          <w:rFonts w:ascii="Times New Roman" w:hAnsi="Times New Roman"/>
+          <w:i/>
+          <w:sz w:val="22"/>
+        </w:rPr>
+        <w:t>Figura 7. Analisis por umbral utilizado para comparar precision, recall, F1 y accuracy.</w:t>
       </w:r>
     </w:p>
     <w:p>
@@ -3320,7 +3455,7 @@
         <w:drawing>
           <wp:inline xmlns:a="http://schemas.openxmlformats.org/drawingml/2006/main" xmlns:pic="http://schemas.openxmlformats.org/drawingml/2006/picture">
             <wp:extent cx="5580000" cy="4782857"/>
-            <wp:docPr id="7" name="Picture 7"/>
+            <wp:docPr id="8" name="Picture 8"/>
             <wp:cNvGraphicFramePr>
               <a:graphicFrameLocks noChangeAspect="1"/>
             </wp:cNvGraphicFramePr>
@@ -3332,7 +3467,7 @@
                     <pic:cNvPicPr/>
                   </pic:nvPicPr>
                   <pic:blipFill>
-                    <a:blip r:embed="rId17"/>
+                    <a:blip r:embed="rId18"/>
                     <a:stretch>
                       <a:fillRect/>
                     </a:stretch>
@@ -3361,7 +3496,7 @@
           <w:i/>
           <w:sz w:val="22"/>
         </w:rPr>
-        <w:t>Figura 7. Matriz de confusion correspondiente a la evaluacion offline del sistema.</w:t>
+        <w:t>Figura 8. Matriz de confusion correspondiente a la evaluacion offline del sistema.</w:t>
       </w:r>
     </w:p>
     <w:p>
@@ -3376,7 +3511,7 @@
         <w:drawing>
           <wp:inline xmlns:a="http://schemas.openxmlformats.org/drawingml/2006/main" xmlns:pic="http://schemas.openxmlformats.org/drawingml/2006/picture">
             <wp:extent cx="5580000" cy="3348000"/>
-            <wp:docPr id="8" name="Picture 8"/>
+            <wp:docPr id="9" name="Picture 9"/>
             <wp:cNvGraphicFramePr>
               <a:graphicFrameLocks noChangeAspect="1"/>
             </wp:cNvGraphicFramePr>
@@ -3388,7 +3523,7 @@
                     <pic:cNvPicPr/>
                   </pic:nvPicPr>
                   <pic:blipFill>
-                    <a:blip r:embed="rId18"/>
+                    <a:blip r:embed="rId19"/>
                     <a:stretch>
                       <a:fillRect/>
                     </a:stretch>
@@ -3417,7 +3552,7 @@
           <w:i/>
           <w:sz w:val="22"/>
         </w:rPr>
-        <w:t>Figura 8. Metricas globales obtenidas en la evaluacion del modelo.</w:t>
+        <w:t>Figura 9. Metricas globales obtenidas en la evaluacion del modelo.</w:t>
       </w:r>
     </w:p>
     <w:p>
@@ -3432,7 +3567,7 @@
         <w:drawing>
           <wp:inline xmlns:a="http://schemas.openxmlformats.org/drawingml/2006/main" xmlns:pic="http://schemas.openxmlformats.org/drawingml/2006/picture">
             <wp:extent cx="5580000" cy="4185000"/>
-            <wp:docPr id="9" name="Picture 9"/>
+            <wp:docPr id="10" name="Picture 10"/>
             <wp:cNvGraphicFramePr>
               <a:graphicFrameLocks noChangeAspect="1"/>
             </wp:cNvGraphicFramePr>
@@ -3444,7 +3579,7 @@
                     <pic:cNvPicPr/>
                   </pic:nvPicPr>
                   <pic:blipFill>
-                    <a:blip r:embed="rId19"/>
+                    <a:blip r:embed="rId20"/>
                     <a:stretch>
                       <a:fillRect/>
                     </a:stretch>
@@ -3473,7 +3608,7 @@
           <w:i/>
           <w:sz w:val="22"/>
         </w:rPr>
-        <w:t>Figura 9. Distribucion de clases utilizada en la evaluacion offline.</w:t>
+        <w:t>Figura 10. Distribucion de clases utilizada en la evaluacion offline.</w:t>
       </w:r>
     </w:p>
     <w:p>
@@ -3673,7 +3808,7 @@
         <w:rPr>
           <w:rFonts w:ascii="Times New Roman" w:hAnsi="Times New Roman"/>
         </w:rPr>
-        <w:t>6. Conclusiones</w:t>
+        <w:t>6. Conclusiones y lineas futuras</w:t>
       </w:r>
     </w:p>
     <w:p>
@@ -3949,9 +4084,12 @@
     <w:sectPr>
       <w:headerReference w:type="default" r:id="rId9"/>
       <w:footerReference w:type="default" r:id="rId10"/>
+      <w:headerReference w:type="first" r:id="rId21"/>
+      <w:footerReference w:type="first" r:id="rId22"/>
       <w:pgSz w:w="12240" w:h="15840"/>
       <w:pgMar w:top="1417" w:right="1417" w:bottom="1417" w:left="1417" w:header="720" w:footer="720" w:gutter="0"/>
       <w:cols w:space="720"/>
+      <w:titlePg/>
       <w:docGrid w:linePitch="360"/>
     </w:sectPr>
   </w:body>
@@ -3972,6 +4110,10 @@
     </w:r>
   </w:p>
 </w:ftr>
+</file>
+
+<file path=word/footer2.xml><?xml version="1.0" encoding="utf-8"?>
+<w:ftr xmlns:m="http://schemas.openxmlformats.org/officeDocument/2006/math" xmlns:mc="http://schemas.openxmlformats.org/markup-compatibility/2006" xmlns:mo="http://schemas.microsoft.com/office/mac/office/2008/main" xmlns:mv="urn:schemas-microsoft-com:mac:vml" xmlns:o="urn:schemas-microsoft-com:office:office" xmlns:r="http://schemas.openxmlformats.org/officeDocument/2006/relationships" xmlns:v="urn:schemas-microsoft-com:vml" xmlns:w10="urn:schemas-microsoft-com:office:word" xmlns:w14="http://schemas.microsoft.com/office/word/2010/wordml" xmlns:w="http://schemas.openxmlformats.org/wordprocessingml/2006/main" xmlns:wne="http://schemas.microsoft.com/office/word/2006/wordml" xmlns:wp14="http://schemas.microsoft.com/office/word/2010/wordprocessingDrawing" xmlns:wp="http://schemas.openxmlformats.org/drawingml/2006/wordprocessingDrawing" xmlns:wpc="http://schemas.microsoft.com/office/word/2010/wordprocessingCanvas" xmlns:wpg="http://schemas.microsoft.com/office/word/2010/wordprocessingGroup" xmlns:wpi="http://schemas.microsoft.com/office/word/2010/wordprocessingInk" xmlns:wps="http://schemas.microsoft.com/office/word/2010/wordprocessingShape" mc:Ignorable="w14 wp14"/>
 </file>
 
 <file path=word/header1.xml><?xml version="1.0" encoding="utf-8"?>
@@ -4063,13 +4205,17 @@
               <w:rFonts w:ascii="Times New Roman" w:hAnsi="Times New Roman"/>
               <w:sz w:val="18"/>
             </w:rPr>
-            <w:t>CURSO 2024-2025</w:t>
+            <w:t>CURSO 2025-2026</w:t>
           </w:r>
         </w:p>
       </w:tc>
     </w:tr>
   </w:tbl>
 </w:hdr>
+</file>
+
+<file path=word/header2.xml><?xml version="1.0" encoding="utf-8"?>
+<w:hdr xmlns:m="http://schemas.openxmlformats.org/officeDocument/2006/math" xmlns:mc="http://schemas.openxmlformats.org/markup-compatibility/2006" xmlns:mo="http://schemas.microsoft.com/office/mac/office/2008/main" xmlns:mv="urn:schemas-microsoft-com:mac:vml" xmlns:o="urn:schemas-microsoft-com:office:office" xmlns:r="http://schemas.openxmlformats.org/officeDocument/2006/relationships" xmlns:v="urn:schemas-microsoft-com:vml" xmlns:w10="urn:schemas-microsoft-com:office:word" xmlns:w14="http://schemas.microsoft.com/office/word/2010/wordml" xmlns:w="http://schemas.openxmlformats.org/wordprocessingml/2006/main" xmlns:wne="http://schemas.microsoft.com/office/word/2006/wordml" xmlns:wp14="http://schemas.microsoft.com/office/word/2010/wordprocessingDrawing" xmlns:wp="http://schemas.openxmlformats.org/drawingml/2006/wordprocessingDrawing" xmlns:wpc="http://schemas.microsoft.com/office/word/2010/wordprocessingCanvas" xmlns:wpg="http://schemas.microsoft.com/office/word/2010/wordprocessingGroup" xmlns:wpi="http://schemas.microsoft.com/office/word/2010/wordprocessingInk" xmlns:wps="http://schemas.microsoft.com/office/word/2010/wordprocessingShape" mc:Ignorable="w14 wp14"/>
 </file>
 
 <file path=word/numbering.xml><?xml version="1.0" encoding="utf-8"?>

</xml_diff>

<commit_message>
Finalize computers TFG delivery artifacts
</commit_message>
<xml_diff>
--- a/tfg_computadores_phishing/docs/MEMORIA_TFG_ETSII_APA7.docx
+++ b/tfg_computadores_phishing/docs/MEMORIA_TFG_ETSII_APA7.docx
@@ -1702,6 +1702,18 @@
       </w:r>
     </w:p>
     <w:p>
+      <w:pPr/>
+      <w:r>
+        <w:t>Lo mas valioso del proyecto, visto desde Ingenieria de Computadores, es que cada fase del ciclo de vida del mensaje queda conectada con la siguiente. La entrada en Telegram, la gestion de sesion, la normalizacion, la inferencia, la escritura en MongoDB, la exposicion por API y la observabilidad en Grafana no aparecen como piezas sueltas, sino como un recorrido continuo que puede ejecutarse, auditarse y mantenerse sobre una infraestructura concreta.</w:t>
+      </w:r>
+    </w:p>
+    <w:p>
+      <w:pPr/>
+      <w:r>
+        <w:t>Aunque el entrenamiento del modelo no constituye el eje principal de esta memoria, tampoco se ha tratado la IA como una caja negra tomada al azar. El sistema se apoya en un modelo derivado de distilbert-base-uncased, con metadatos de entrenamiento documentados, checkpoints conservados y un pipeline previo de preparacion de datasets que combina fuentes de referencia como malicious_phish.csv, phishing.csv y spam.csv antes de generar los conjuntos equilibrados utilizados en la experimentacion.</w:t>
+      </w:r>
+    </w:p>
+    <w:p>
       <w:r>
         <w:t>La principal aportacion del trabajo no es solo el modelo, sino la integracion de componentes en un flujo trazable y defendible, orientado a un escenario realista de operacion y pensado para poder desplegarse, mantenerse y auditarse como un sistema tecnico coherente.</w:t>
       </w:r>
@@ -1771,6 +1783,12 @@
       </w:r>
     </w:p>
     <w:p>
+      <w:pPr/>
+      <w:r>
+        <w:t>Esta forma de plantearlo ayuda tambien a diferenciar con claridad este trabajo del futuro TFG de fake news. Mientras aquel puede centrarse con mayor naturalidad en datos, preprocesado, entrenamiento, evaluacion y logica de aplicacion, aqui el peso recae en la arquitectura del pipeline, en la integracion entre modulos y en las decisiones de ejecucion, almacenamiento y observabilidad necesarias para operar el sistema.</w:t>
+      </w:r>
+    </w:p>
+    <w:p>
       <w:pPr>
         <w:pStyle w:val="Ttulo2"/>
         <w:rPr>
@@ -1805,6 +1823,12 @@
     <w:p>
       <w:r>
         <w:t>Desarrollar un pipeline modular para capturar, procesar y clasificar mensajes de Telegram relacionados con phishing o actividad sospechosa, integrando almacenamiento, publicacion de resultados y monitorizacion tecnica para su uso en un contexto empresarial.</w:t>
+      </w:r>
+    </w:p>
+    <w:p>
+      <w:pPr/>
+      <w:r>
+        <w:t>En esta memoria, ese objetivo se entiende ademas como el diseno de un sistema desplegable y auditable. Por eso, ademas del resultado de clasificacion, resulta importante explicar como se autentica la fuente, como se encadena cada componente, que evidencias se persisten y como se supervisa el comportamiento del conjunto.</w:t>
       </w:r>
     </w:p>
     <w:p>
@@ -1872,6 +1896,22 @@
     </w:p>
     <w:p>
       <w:pPr>
+        <w:pStyle w:val="Listaconnmeros"/>
+      </w:pPr>
+      <w:r>
+        <w:t>Definir una topologia de ejecucion reproducible mediante contenedores y servicios desacoplados, separando captura, persistencia, API y observabilidad.</w:t>
+      </w:r>
+    </w:p>
+    <w:p>
+      <w:pPr>
+        <w:pStyle w:val="Listaconnmeros"/>
+      </w:pPr>
+      <w:r>
+        <w:t>Documentar la procedencia del modelo y de los datos de entrenamiento con el suficiente detalle para justificar la integracion de la IA dentro del sistema, sin desplazar el foco principal de la memoria hacia el entrenamiento.</w:t>
+      </w:r>
+    </w:p>
+    <w:p>
+      <w:pPr>
         <w:pStyle w:val="Ttulo2"/>
         <w:rPr>
           <w:rFonts w:ascii="Times New Roman" w:hAnsi="Times New Roman"/>
@@ -2105,6 +2145,18 @@
     <w:p>
       <w:r>
         <w:t>Estas preguntas obligan a pensar el problema como un pipeline de sistemas. Por eso, el proyecto no se ha orientado solo a la mejora de un clasificador, sino al ensamblaje de varios modulos coordinados que permitan desplegar la solucion, validarla y operarla.</w:t>
+      </w:r>
+    </w:p>
+    <w:p>
+      <w:pPr/>
+      <w:r>
+        <w:t>Mirado asi, el mensaje deja de ser un simple texto y pasa a ser una unidad de trabajo que atraviesa varias capas tecnicas. Primero hay una capa de adquisicion, responsable de mantener la sesion con Telegram y recibir eventos NewMessage. Despues entra en juego una capa de transformacion, donde el contenido se normaliza, se detecta el idioma y se prepara la entrada del modelo. A continuacion actua la capa de decision, que calcula score_1, aplica el umbral operativo y adjunta metadatos del modelo y del dispositivo. Finalmente aparecen las capas de persistencia y explotacion, que almacenan el evento de forma pseudonimizada, lo publican mediante endpoints y lo convierten en una fuente de consulta operativa para React y Grafana.</w:t>
+      </w:r>
+    </w:p>
+    <w:p>
+      <w:pPr/>
+      <w:r>
+        <w:t>Precisamente por eso este TFG encaja mejor en Ingenieria de Computadores. El interes academico no se agota en la calidad del clasificador, sino en la capacidad de integrar comunicaciones, almacenamiento, servicios, observabilidad y controles minimos de seguridad en un sistema coherente.</w:t>
       </w:r>
     </w:p>
     <w:p>
@@ -2971,6 +3023,12 @@
       </w:r>
     </w:p>
     <w:p>
+      <w:pPr/>
+      <w:r>
+        <w:t>Si se baja de la arquitectura logica a la infraestructura real del proyecto, esos bloques se corresponden tambien con unidades de ejecucion diferenciadas. El servicio bot se ocupa de la escucha e inferencia online, mongo conserva la traza operativa, api sirve como contrato de acceso a resultados y grafana consume esos datos a traves de la API. El frontend React actua como otra capa de explotacion, mas orientada a la inspeccion funcional, mientras que la evaluacion offline y los scripts de simulacion permiten medir el rendimiento sin depender del trafico real.</w:t>
+      </w:r>
+    </w:p>
+    <w:p>
       <w:pPr>
         <w:pStyle w:val="Ttulo2"/>
         <w:rPr>
@@ -3059,6 +3117,18 @@
       </w:pPr>
       <w:r>
         <w:t>La informacion queda disponible para consulta, auditoria y visualizacion.</w:t>
+      </w:r>
+    </w:p>
+    <w:p>
+      <w:pPr/>
+      <w:r>
+        <w:t>En la practica, este recorrido se convierte en una cadena de transformaciones muy concreta. main.py valida primero las variables TELEGRAM_API_ID, TELEGRAM_API_HASH y TELEGRAM_PHONE, construye la sesion de Telethon y espera eventos entrantes. Cuando llega un mensaje con contenido textual, analizar_texto() obtiene una version normalizada e intenta detectar el idioma; despues clasificar_binario() tokeniza el texto, ejecuta la inferencia en CPU o GPU y devuelve pred, score_1 y latency_ms; por ultimo, build_message_document() empaqueta el resultado junto con run_id, hashes, metadatos del modelo y estado de la operacion antes de que collection.insert_one() persista el evento.</w:t>
+      </w:r>
+    </w:p>
+    <w:p>
+      <w:pPr/>
+      <w:r>
+        <w:t>Este comportamiento es importante porque muestra que la trazabilidad no se anade a posteriori. La evidencia tecnica se genera en el mismo recorrido del mensaje y acompana a la decision desde el instante en que el evento entra en el sistema. De ese modo, almacenamiento, evaluacion posterior y explotacion visual comparten una misma estructura de informacion.</w:t>
       </w:r>
     </w:p>
     <w:p>
@@ -3502,6 +3572,24 @@
       </w:r>
     </w:p>
     <w:p>
+      <w:pPr/>
+      <w:r>
+        <w:t>La topologia definida en docker-compose.yml despliega cuatro servicios principales. mongo utiliza la imagen mongo:7.0, conserva datos en un volumen dedicado y publica solo expose: 27017, de modo que la base de datos no queda abierta al exterior por defecto. bot se construye a partir del Dockerfile del proyecto, hereda configuracion desde .env, depende del estado saludable de MongoDB y monta session/, data/ y reports/ para persistir sesion, datos auxiliares y artefactos. api reutiliza la misma imagen base, expone 8000:8000, monta reports/ y docs/ y arranca uvicorn para servir la interfaz HTTP. Finalmente, grafana se apoya en un volumen propio, depende de la API y carga automaticamente su datasource y dashboards provisionados.</w:t>
+      </w:r>
+    </w:p>
+    <w:p>
+      <w:pPr/>
+      <w:r>
+        <w:t>Esta separacion aporta ventajas practicas desde la perspectiva de sistemas. Por un lado, desacopla captura, persistencia, consulta y monitorizacion, de forma que cada bloque puede arrancar o diagnosticarse con criterios propios. Por otro, obliga a pensar de manera explicita en dependencias, puertos, volumenes y variables de entorno como MONGO_URI, API_KEY, GRAFANA_ADMIN_USER o GRAFANA_ADMIN_PASSWORD. En un contexto academico, este detalle es valioso porque convierte el TFG en una arquitectura ejecutable y no solo en una descripcion conceptual.</w:t>
+      </w:r>
+    </w:p>
+    <w:p>
+      <w:pPr/>
+      <w:r>
+        <w:t>Tambien conviene destacar que la observabilidad no se resuelve unicamente con logs. El servicio de MongoDB dispone de healthcheck, la API incorpora un endpoint /api/v1/health para comprobar simultaneamente estado de Mongo y de los reportes, y Grafana consulta estadisticas agregadas a traves de la propia API. La infraestructura, por tanto, no solo ejecuta el pipeline, sino que aporta mecanismos minimos para detectar degradaciones y revisar su estado operativo.</w:t>
+      </w:r>
+    </w:p>
+    <w:p>
       <w:pPr>
         <w:pStyle w:val="Ttulo1"/>
         <w:rPr>
@@ -3708,6 +3796,18 @@
       </w:r>
     </w:p>
     <w:p>
+      <w:pPr/>
+      <w:r>
+        <w:t>Aunque esta memoria no desarrolla el entrenamiento con el detalle propio del TFG de Informatica, si conviene explicar de donde sale el modelo integrado. model_loader.py intenta cargar primero un repositorio Transformers completo y, si falla, utiliza un mecanismo de compatibilidad para descargar desde Hugging Face un state_dict y reconstruir el modelo sobre la base distilbert-base-uncased. Esta decision evita depender de un unico formato de publicacion y refuerza la robustez del sistema en despliegue.</w:t>
+      </w:r>
+    </w:p>
+    <w:p>
+      <w:pPr/>
+      <w:r>
+        <w:t>La evidencia disponible en docs/training_metadata.json, scripts_experimentos/, datos_entrenamiento/ y modelos_entrenados/ muestra ademas que el modelo no se ha seleccionado de forma arbitraria. El pipeline previo combina datasets como malicious_phish.csv, phishing.csv y spam.csv, genera combined_cyber_dataset.csv, equilibra clases en combined_cyber_balanced.csv y utiliza un conjunto de trabajo documentado como balanced_dataset_generated.csv. Sobre esa base, scripts como AITrainer_distilbert_2.py entrenan una variante de DistilBERT con cabeza de clasificacion propia, dejando checkpoints como distilbert_best.pt y distilbert_fast_fixed_labels.pt. En consecuencia, la IA que consume este pipeline debe entenderse como un componente entrenado y trazable dentro del sistema, no como una dependencia opaca tomada al azar.</w:t>
+      </w:r>
+    </w:p>
+    <w:p>
       <w:pPr>
         <w:pStyle w:val="Ttulo2"/>
         <w:rPr>
@@ -3969,6 +4069,18 @@
       </w:r>
     </w:p>
     <w:p>
+      <w:pPr/>
+      <w:r>
+        <w:t>En la practica, la persistencia tambien incorpora decisiones de mantenimiento que suelen quedar fuera de una memoria centrada solo en modelos. ensure_indexes() crea indices para run_id, msg_sha256 y created_at_utc, lo que mejora tanto la consulta como la trazabilidad temporal. Ademas, sobre created_at_utc se define un indice TTL configurado mediante RETENTION_DAYS, con objeto de limitar la retencion automatica de evidencias cuando asi se desee.</w:t>
+      </w:r>
+    </w:p>
+    <w:p>
+      <w:pPr/>
+      <w:r>
+        <w:t>La pseudonimizacion se realiza mediante privacy_utils.py, que genera user_hash y chat_hash con sha256 y una sal configurable. Junto a ello, las variables STORE_MSG_ORIGINAL, STORE_MSG_NORMALIZED y STORE_NLP_FEATURES permiten activar o no campos adicionales segun el nivel de detalle que requiera la operacion. Esta parametrizacion hace visible un aspecto importante de sistemas: la persistencia no es solo un repositorio pasivo, sino un punto de equilibrio entre auditoria, privacidad, volumen de datos y coste de almacenamiento.</w:t>
+      </w:r>
+    </w:p>
+    <w:p>
       <w:pPr>
         <w:pStyle w:val="Ttulo2"/>
         <w:rPr>
@@ -4101,6 +4213,18 @@
       </w:r>
     </w:p>
     <w:p>
+      <w:pPr/>
+      <w:r>
+        <w:t>La organizacion de artefactos en reports/runs/&lt;run_id&gt;/ tiene ademas una ventaja arquitectonica clara: separa el historico canonico de la copia de conveniencia. reporting.py replica en la raiz de reports/ un pequeno conjunto de ficheros recientes para compatibilidad operativa, pero conserva en cada subdirectorio la version integra de metrics.json, predictions.csv, threshold_analysis.csv y confusion_matrix.csv. A esto se suma el uso de reports/validations/&lt;validation_id&gt;/ para la evidencia de validacion integrada, lo que facilita distinguir entre ejecuciones de evaluacion y ejecuciones de chequeo.</w:t>
+      </w:r>
+    </w:p>
+    <w:p>
+      <w:pPr/>
+      <w:r>
+        <w:t>En terminos de integracion, run_id actua como identificador comun entre el clasificador offline, la API, el dashboard web y los scripts de comprobacion. Gracias a ello, una consulta sobre thresholds, una matriz de confusion y una vista de resumen pueden referirse exactamente a la misma ejecucion sin ambiguedades. Este desacoplamiento entre historico y ultima copia visible es una decision pequena, pero muy representativa del enfoque de sistemas adoptado.</w:t>
+      </w:r>
+    </w:p>
+    <w:p>
       <w:pPr>
         <w:pStyle w:val="Ttulo2"/>
         <w:rPr>
@@ -4156,6 +4280,18 @@
       </w:r>
       <w:r>
         <w:t>) para evitar que la importacion falle cuando aun no se han definido ciertas variables de entorno. Esa decision mejora la robustez del proyecto y facilita las pruebas automatizadas.</w:t>
+      </w:r>
+    </w:p>
+    <w:p>
+      <w:pPr/>
+      <w:r>
+        <w:t>Mas que una lista de endpoints, la API debe entenderse como el contrato operativo del sistema. api/app.py centraliza autenticacion simple mediante dependencia, validacion de parametros, politicas CORS y serializacion de respuestas. api/services.py desacopla la logica de acceso a MongoDB y a los artefactos de reports/, de manera que las vistas consuman una interfaz estable aunque cambie la fuente de datos subyacente. En la practica, esto permite que /api/v1/runs, /api/v1/runs/{run_id}/summary, /api/v1/runs/{run_id}/thresholds, /api/v1/runs/{run_id}/confusion-matrix, /api/v1/messages, /api/v1/messages/stats y /api/v1/training/metadata funcionen como puntos de integracion reutilizables para cualquier consumidor posterior.</w:t>
+      </w:r>
+    </w:p>
+    <w:p>
+      <w:pPr/>
+      <w:r>
+        <w:t>La propia configuracion refuerza el enfoque de despliegue defendible. api/settings.py exige API_KEY, define origenes CORS concretos y resuelve rutas hacia reports/ y docs/training_metadata.json. Esto significa que la API no solo expone datos: tambien codifica reglas de seguridad minima, dependencias de infraestructura y convenciones de ubicacion de artefactos. Dicho de otro modo, la capa HTTP actua como frontera controlada entre la instrumentacion interna del pipeline y la consulta externa.</w:t>
       </w:r>
     </w:p>
     <w:p>
@@ -4371,6 +4507,18 @@
       </w:r>
     </w:p>
     <w:p>
+      <w:pPr/>
+      <w:r>
+        <w:t>El dashboard React y Grafana no duplican exactamente el mismo papel. El primero permite inspeccionar ejecuciones concretas, revisar mensajes, filtrar por prediccion o score y consultar directamente la metadata de entrenamiento servida por la API. En cambio, Grafana se configura como una capa de observabilidad ligera: el datasource marcusolsson-json-datasource apunta a http://api:8000, inyecta el encabezado X-API-Key y consume rutas como /api/v1/messages/stats?limit=500 para construir paneles de volumen, latencia y distribucion de scores.</w:t>
+      </w:r>
+    </w:p>
+    <w:p>
+      <w:pPr/>
+      <w:r>
+        <w:t>Este detalle de integracion es relevante porque evita el acceso directo de Grafana a MongoDB y reutiliza la misma interfaz protegida que emplea el dashboard web. La observabilidad, por tanto, queda alineada con el contrato de la API y con la politica de seguridad minima del proyecto. Desde una perspectiva de Ingenieria de Computadores, esta decision es preferible a una conexion ad hoc porque simplifica la superficie de exposicion y hace mas facil auditar que informacion sale realmente del sistema.</w:t>
+      </w:r>
+    </w:p>
+    <w:p>
       <w:pPr>
         <w:pStyle w:val="Ttulo2"/>
         <w:rPr>
@@ -4618,6 +4766,14 @@
         <w:pStyle w:val="Listaconvietas"/>
       </w:pPr>
       <w:r>
+        <w:t>tasa_error_prueba = 0.37</w:t>
+      </w:r>
+    </w:p>
+    <w:p>
+      <w:pPr>
+        <w:pStyle w:val="Listaconvietas"/>
+      </w:pPr>
+      <w:r>
         <w:rPr>
           <w:rFonts w:ascii="Consolas" w:hAnsi="Consolas"/>
           <w:sz w:val="20"/>
@@ -4675,7 +4831,13 @@
     </w:p>
     <w:p>
       <w:r>
-        <w:t>Estos valores muestran un comportamiento coherente con la filosofia del sistema: se acepta una precision moderada para maximizar la capacidad de deteccion temprana de amenazas reales.</w:t>
+        <w:t>La tasa de error en datos de prueba se obtiene directamente como 1 - accuracy, por lo que el sistema falla en 37 de cada 100 muestras del conjunto offline utilizado en la evaluacion. Este valor sigue siendo coherente con la filosofia del sistema: se acepta una precision moderada para maximizar la capacidad de deteccion temprana de amenazas reales.</w:t>
+      </w:r>
+    </w:p>
+    <w:p>
+      <w:pPr/>
+      <w:r>
+        <w:t>En cambio, no se incorpora una tasa de error de entrenamiento cerrada. El repositorio conserva hiperparametros, split, checkpoints y metadatos del proceso, pero no un artefacto final persistido que documente de forma directa y reproducible ese error de entrenamiento. Por rigor metodologico, no resulta adecuado fijar una cifra que no pueda trazarse de manera inmediata desde los artefactos finales disponibles.</w:t>
       </w:r>
     </w:p>
     <w:p>
@@ -5473,6 +5635,18 @@
       </w:r>
     </w:p>
     <w:p>
+      <w:pPr/>
+      <w:r>
+        <w:t>Ademas, la memoria permite justificar que la IA integrada responde a un proceso previo de entrenamiento documentado y no a la seleccion casual de un modelo externo. Sin embargo, ese componente se presenta aqui como parte de una arquitectura mayor: una pieza necesaria para la decision automatica, pero subordinada al diseno del pipeline, a la persistencia de evidencias, a la interfaz de consulta y a la observabilidad del sistema completo.</w:t>
+      </w:r>
+    </w:p>
+    <w:p>
+      <w:pPr/>
+      <w:r>
+        <w:t>Desde el punto de vista cuantitativo, la tasa de error de prueba del 37% confirma que el sistema no debe interpretarse como un clasificador final autonomo, sino como una primera criba sensible orientada a reducir tiempo de reaccion y a priorizar revision posterior. Precisamente por eso el recall alto y el umbral conservador tienen mas peso operativo que una accuracy maxima. Del mismo modo, la ausencia de un artefacto final con tasa de error de entrenamiento aconseja reforzar en futuras iteraciones la trazabilidad completa del entrenamiento si se desea comparar con mas detalle ajuste interno y comportamiento en prueba.</w:t>
+      </w:r>
+    </w:p>
+    <w:p>
       <w:r>
         <w:t>Como lineas de trabajo futuro, resultaria razonable:</w:t>
       </w:r>
@@ -5512,6 +5686,9 @@
     <w:p>
       <w:r>
         <w:t>En su estado actual, el TFG queda mejor diferenciado respecto al futuro TFG de fake news: aqui el peso esta en la arquitectura del pipeline, la integracion de componentes y la operacion del sistema completo.</w:t>
+      </w:r>
+      <w:r>
+        <w:t xml:space="preserve"> El otro trabajo puede reservar para si el foco principal en datos, entrenamiento, evaluacion de modelos y logica de procesamiento de la informacion. Esa separacion no solo distingue temas; tambien distingue responsabilidades tecnicas y academicas de forma coherente entre ambas titulaciones.</w:t>
       </w:r>
     </w:p>
     <w:p>

</xml_diff>